<commit_message>
Revised Draft (14 days lag, nb, ...)
</commit_message>
<xml_diff>
--- a/CodeR/Preprocess.docx
+++ b/CodeR/Preprocess.docx
@@ -23,7 +23,7 @@
         <w:pStyle w:val="Date"/>
       </w:pPr>
       <w:r>
-        <w:t xml:space="preserve">Rewritten: 2026-05-16 to 2026-07-08 / Executed: 2026-07-08</w:t>
+        <w:t xml:space="preserve">Rewritten: 2026-05-16 to 2026-09-03 / Executed: 2026-09-03</w:t>
       </w:r>
     </w:p>
     <w:bookmarkStart w:id="18" w:name="setup"/>
@@ -7085,11 +7085,12 @@
       </w:tblPr>
       <w:tblGrid>
         <w:gridCol w:w="1050"/>
-        <w:gridCol w:w="1610"/>
-        <w:gridCol w:w="1610"/>
-        <w:gridCol w:w="1610"/>
-        <w:gridCol w:w="1610"/>
-        <w:gridCol w:w="1610"/>
+        <w:gridCol w:w="1110"/>
+        <w:gridCol w:w="1110"/>
+        <w:gridCol w:w="1110"/>
+        <w:gridCol w:w="1110"/>
+        <w:gridCol w:w="1110"/>
+        <w:gridCol w:w="1110"/>
       </w:tblGrid>
       <w:tr>
         <w:trPr>
@@ -7146,7 +7147,7 @@
                 <w:szCs w:val="22"/>
                 <w:color w:val="000000"/>
               </w:rPr>
-              <w:t xml:space="preserve">age</w:t>
+              <w:t xml:space="preserve">Age</w:t>
             </w:r>
           </w:p>
         </w:tc>
@@ -7200,7 +7201,7 @@
                 <w:szCs w:val="22"/>
                 <w:color w:val="000000"/>
               </w:rPr>
-              <w:t xml:space="preserve">1990-1996</w:t>
+              <w:t xml:space="preserve">1990</w:t>
             </w:r>
           </w:p>
         </w:tc>
@@ -7254,7 +7255,7 @@
                 <w:szCs w:val="22"/>
                 <w:color w:val="000000"/>
               </w:rPr>
-              <w:t xml:space="preserve">1998-2004</w:t>
+              <w:t xml:space="preserve">1999</w:t>
             </w:r>
           </w:p>
         </w:tc>
@@ -7308,7 +7309,7 @@
                 <w:szCs w:val="22"/>
                 <w:color w:val="000000"/>
               </w:rPr>
-              <w:t xml:space="preserve">2005-2011</w:t>
+              <w:t xml:space="preserve">2006</w:t>
             </w:r>
           </w:p>
         </w:tc>
@@ -7362,7 +7363,7 @@
                 <w:szCs w:val="22"/>
                 <w:color w:val="000000"/>
               </w:rPr>
-              <w:t xml:space="preserve">2012-2018</w:t>
+              <w:t xml:space="preserve">2011</w:t>
             </w:r>
           </w:p>
         </w:tc>
@@ -7416,7 +7417,61 @@
                 <w:szCs w:val="22"/>
                 <w:color w:val="000000"/>
               </w:rPr>
-              <w:t xml:space="preserve">2019-2025</w:t>
+              <w:t xml:space="preserve">2016</w:t>
+            </w:r>
+          </w:p>
+        </w:tc>
+        <w:tc>
+          <w:tcPr>
+            <w:tcBorders>
+              <w:bottom w:val="single" w:sz="12" w:space="0" w:color="666666"/>
+              <w:top w:val="single" w:sz="12" w:space="0" w:color="666666"/>
+              <w:left w:val="none" w:sz="0" w:space="0" w:color="000000"/>
+              <w:right w:val="none" w:sz="0" w:space="0" w:color="000000"/>
+            </w:tcBorders>
+            <w:shd w:val="clear" w:color="auto" w:fill="FFFFFF"/>
+            <w:tcMar>
+              <w:top w:w="0" w:type="dxa"/>
+              <w:bottom w:w="0" w:type="dxa"/>
+              <w:left w:w="0" w:type="dxa"/>
+              <w:right w:w="0" w:type="dxa"/>
+            </w:tcMar>
+            <w:vAlign w:val="center"/>
+          </w:tcPr>
+          <w:p>
+            <w:pPr>
+              <w:jc w:val="center"/>
+              <w:pBdr>
+                <w:bottom w:val="none" w:sz="0" w:space="0" w:color="000000"/>
+                <w:top w:val="none" w:sz="0" w:space="0" w:color="000000"/>
+                <w:left w:val="none" w:sz="0" w:space="0" w:color="000000"/>
+                <w:right w:val="none" w:sz="0" w:space="0" w:color="000000"/>
+              </w:pBdr>
+              <w:spacing w:after="100" w:before="100" w:line="240"/>
+              <w:ind w:left="100" w:right="100" w:firstLine="0" w:firstLineChars="0"/>
+              <w:rPr>
+                <w:rFonts w:ascii="DejaVu Sans" w:hAnsi="DejaVu Sans" w:eastAsia="DejaVu Sans" w:cs="DejaVu Sans"/>
+                <w:i w:val="false"/>
+                <w:b w:val="false"/>
+                <w:u w:val="none"/>
+                <w:strike w:val="false"/>
+                <w:sz w:val="22"/>
+                <w:szCs w:val="22"/>
+                <w:color w:val="000000"/>
+              </w:rPr>
+            </w:pPr>
+            <w:r>
+              <w:rPr>
+                <w:rFonts w:ascii="DejaVu Sans" w:hAnsi="DejaVu Sans" w:eastAsia="DejaVu Sans" w:cs="DejaVu Sans"/>
+                <w:i w:val="false"/>
+                <w:b w:val="false"/>
+                <w:u w:val="none"/>
+                <w:strike w:val="false"/>
+                <w:sz w:val="22"/>
+                <w:szCs w:val="22"/>
+                <w:color w:val="000000"/>
+              </w:rPr>
+              <w:t xml:space="preserve">2022</w:t>
             </w:r>
           </w:p>
         </w:tc>
@@ -7529,7 +7584,7 @@
                 <w:szCs w:val="22"/>
                 <w:color w:val="000000"/>
               </w:rPr>
-              <w:t xml:space="preserve">1.9%</w:t>
+              <w:t xml:space="preserve">2.2%</w:t>
             </w:r>
           </w:p>
         </w:tc>
@@ -7583,7 +7638,7 @@
                 <w:szCs w:val="22"/>
                 <w:color w:val="000000"/>
               </w:rPr>
-              <w:t xml:space="preserve">1.4%</w:t>
+              <w:t xml:space="preserve">1.5%</w:t>
             </w:r>
           </w:p>
         </w:tc>
@@ -7638,6 +7693,60 @@
                 <w:color w:val="000000"/>
               </w:rPr>
               <w:t xml:space="preserve">1.2%</w:t>
+            </w:r>
+          </w:p>
+        </w:tc>
+        <w:tc>
+          <w:tcPr>
+            <w:tcBorders>
+              <w:bottom w:val="none" w:sz="0" w:space="0" w:color="000000"/>
+              <w:top w:val="single" w:sz="12" w:space="0" w:color="666666"/>
+              <w:left w:val="none" w:sz="0" w:space="0" w:color="000000"/>
+              <w:right w:val="none" w:sz="0" w:space="0" w:color="000000"/>
+            </w:tcBorders>
+            <w:shd w:val="clear" w:color="auto" w:fill="FFFFFF"/>
+            <w:tcMar>
+              <w:top w:w="0" w:type="dxa"/>
+              <w:bottom w:w="0" w:type="dxa"/>
+              <w:left w:w="0" w:type="dxa"/>
+              <w:right w:w="0" w:type="dxa"/>
+            </w:tcMar>
+            <w:vAlign w:val="center"/>
+          </w:tcPr>
+          <w:p>
+            <w:pPr>
+              <w:jc w:val="center"/>
+              <w:pBdr>
+                <w:bottom w:val="none" w:sz="0" w:space="0" w:color="000000"/>
+                <w:top w:val="none" w:sz="0" w:space="0" w:color="000000"/>
+                <w:left w:val="none" w:sz="0" w:space="0" w:color="000000"/>
+                <w:right w:val="none" w:sz="0" w:space="0" w:color="000000"/>
+              </w:pBdr>
+              <w:spacing w:after="100" w:before="100" w:line="240"/>
+              <w:ind w:left="100" w:right="100" w:firstLine="0" w:firstLineChars="0"/>
+              <w:rPr>
+                <w:rFonts w:ascii="DejaVu Sans" w:hAnsi="DejaVu Sans" w:eastAsia="DejaVu Sans" w:cs="DejaVu Sans"/>
+                <w:i w:val="false"/>
+                <w:b w:val="false"/>
+                <w:u w:val="none"/>
+                <w:strike w:val="false"/>
+                <w:sz w:val="22"/>
+                <w:szCs w:val="22"/>
+                <w:color w:val="000000"/>
+              </w:rPr>
+            </w:pPr>
+            <w:r>
+              <w:rPr>
+                <w:rFonts w:ascii="DejaVu Sans" w:hAnsi="DejaVu Sans" w:eastAsia="DejaVu Sans" w:cs="DejaVu Sans"/>
+                <w:i w:val="false"/>
+                <w:b w:val="false"/>
+                <w:u w:val="none"/>
+                <w:strike w:val="false"/>
+                <w:sz w:val="22"/>
+                <w:szCs w:val="22"/>
+                <w:color w:val="000000"/>
+              </w:rPr>
+              <w:t xml:space="preserve">1.0%</w:t>
             </w:r>
           </w:p>
         </w:tc>
@@ -7858,7 +7967,7 @@
                 <w:szCs w:val="22"/>
                 <w:color w:val="000000"/>
               </w:rPr>
-              <w:t xml:space="preserve">4.5%</w:t>
+              <w:t xml:space="preserve">4.6%</w:t>
             </w:r>
           </w:p>
         </w:tc>
@@ -7912,7 +8021,7 @@
                 <w:szCs w:val="22"/>
                 <w:color w:val="000000"/>
               </w:rPr>
-              <w:t xml:space="preserve">3.2%</w:t>
+              <w:t xml:space="preserve">3.4%</w:t>
             </w:r>
           </w:p>
         </w:tc>
@@ -7966,7 +8075,7 @@
                 <w:szCs w:val="22"/>
                 <w:color w:val="000000"/>
               </w:rPr>
-              <w:t xml:space="preserve">2.5%</w:t>
+              <w:t xml:space="preserve">2.7%</w:t>
             </w:r>
           </w:p>
         </w:tc>
@@ -8020,7 +8129,61 @@
                 <w:szCs w:val="22"/>
                 <w:color w:val="000000"/>
               </w:rPr>
-              <w:t xml:space="preserve">1.9%</w:t>
+              <w:t xml:space="preserve">2.3%</w:t>
+            </w:r>
+          </w:p>
+        </w:tc>
+        <w:tc>
+          <w:tcPr>
+            <w:tcBorders>
+              <w:bottom w:val="none" w:sz="0" w:space="0" w:color="000000"/>
+              <w:top w:val="none" w:sz="0" w:space="0" w:color="000000"/>
+              <w:left w:val="none" w:sz="0" w:space="0" w:color="000000"/>
+              <w:right w:val="none" w:sz="0" w:space="0" w:color="000000"/>
+            </w:tcBorders>
+            <w:shd w:val="clear" w:color="auto" w:fill="FFFFFF"/>
+            <w:tcMar>
+              <w:top w:w="0" w:type="dxa"/>
+              <w:bottom w:w="0" w:type="dxa"/>
+              <w:left w:w="0" w:type="dxa"/>
+              <w:right w:w="0" w:type="dxa"/>
+            </w:tcMar>
+            <w:vAlign w:val="center"/>
+          </w:tcPr>
+          <w:p>
+            <w:pPr>
+              <w:jc w:val="center"/>
+              <w:pBdr>
+                <w:bottom w:val="none" w:sz="0" w:space="0" w:color="000000"/>
+                <w:top w:val="none" w:sz="0" w:space="0" w:color="000000"/>
+                <w:left w:val="none" w:sz="0" w:space="0" w:color="000000"/>
+                <w:right w:val="none" w:sz="0" w:space="0" w:color="000000"/>
+              </w:pBdr>
+              <w:spacing w:after="100" w:before="100" w:line="240"/>
+              <w:ind w:left="100" w:right="100" w:firstLine="0" w:firstLineChars="0"/>
+              <w:rPr>
+                <w:rFonts w:ascii="DejaVu Sans" w:hAnsi="DejaVu Sans" w:eastAsia="DejaVu Sans" w:cs="DejaVu Sans"/>
+                <w:i w:val="false"/>
+                <w:b w:val="false"/>
+                <w:u w:val="none"/>
+                <w:strike w:val="false"/>
+                <w:sz w:val="22"/>
+                <w:szCs w:val="22"/>
+                <w:color w:val="000000"/>
+              </w:rPr>
+            </w:pPr>
+            <w:r>
+              <w:rPr>
+                <w:rFonts w:ascii="DejaVu Sans" w:hAnsi="DejaVu Sans" w:eastAsia="DejaVu Sans" w:cs="DejaVu Sans"/>
+                <w:i w:val="false"/>
+                <w:b w:val="false"/>
+                <w:u w:val="none"/>
+                <w:strike w:val="false"/>
+                <w:sz w:val="22"/>
+                <w:szCs w:val="22"/>
+                <w:color w:val="000000"/>
+              </w:rPr>
+              <w:t xml:space="preserve">1.8%</w:t>
             </w:r>
           </w:p>
         </w:tc>
@@ -8187,7 +8350,7 @@
                 <w:szCs w:val="22"/>
                 <w:color w:val="000000"/>
               </w:rPr>
-              <w:t xml:space="preserve">11.8%</w:t>
+              <w:t xml:space="preserve">12.1%</w:t>
             </w:r>
           </w:p>
         </w:tc>
@@ -8241,7 +8404,7 @@
                 <w:szCs w:val="22"/>
                 <w:color w:val="000000"/>
               </w:rPr>
-              <w:t xml:space="preserve">12.3%</w:t>
+              <w:t xml:space="preserve">11.7%</w:t>
             </w:r>
           </w:p>
         </w:tc>
@@ -8295,7 +8458,7 @@
                 <w:szCs w:val="22"/>
                 <w:color w:val="000000"/>
               </w:rPr>
-              <w:t xml:space="preserve">12.5%</w:t>
+              <w:t xml:space="preserve">13.1%</w:t>
             </w:r>
           </w:p>
         </w:tc>
@@ -8349,7 +8512,7 @@
                 <w:szCs w:val="22"/>
                 <w:color w:val="000000"/>
               </w:rPr>
-              <w:t xml:space="preserve">10.3%</w:t>
+              <w:t xml:space="preserve">11.9%</w:t>
             </w:r>
           </w:p>
         </w:tc>
@@ -8403,7 +8566,61 @@
                 <w:szCs w:val="22"/>
                 <w:color w:val="000000"/>
               </w:rPr>
-              <w:t xml:space="preserve">8.6%</w:t>
+              <w:t xml:space="preserve">9.9%</w:t>
+            </w:r>
+          </w:p>
+        </w:tc>
+        <w:tc>
+          <w:tcPr>
+            <w:tcBorders>
+              <w:bottom w:val="none" w:sz="0" w:space="0" w:color="000000"/>
+              <w:top w:val="none" w:sz="0" w:space="0" w:color="000000"/>
+              <w:left w:val="none" w:sz="0" w:space="0" w:color="000000"/>
+              <w:right w:val="none" w:sz="0" w:space="0" w:color="000000"/>
+            </w:tcBorders>
+            <w:shd w:val="clear" w:color="auto" w:fill="FFFFFF"/>
+            <w:tcMar>
+              <w:top w:w="0" w:type="dxa"/>
+              <w:bottom w:w="0" w:type="dxa"/>
+              <w:left w:w="0" w:type="dxa"/>
+              <w:right w:w="0" w:type="dxa"/>
+            </w:tcMar>
+            <w:vAlign w:val="center"/>
+          </w:tcPr>
+          <w:p>
+            <w:pPr>
+              <w:jc w:val="center"/>
+              <w:pBdr>
+                <w:bottom w:val="none" w:sz="0" w:space="0" w:color="000000"/>
+                <w:top w:val="none" w:sz="0" w:space="0" w:color="000000"/>
+                <w:left w:val="none" w:sz="0" w:space="0" w:color="000000"/>
+                <w:right w:val="none" w:sz="0" w:space="0" w:color="000000"/>
+              </w:pBdr>
+              <w:spacing w:after="100" w:before="100" w:line="240"/>
+              <w:ind w:left="100" w:right="100" w:firstLine="0" w:firstLineChars="0"/>
+              <w:rPr>
+                <w:rFonts w:ascii="DejaVu Sans" w:hAnsi="DejaVu Sans" w:eastAsia="DejaVu Sans" w:cs="DejaVu Sans"/>
+                <w:i w:val="false"/>
+                <w:b w:val="false"/>
+                <w:u w:val="none"/>
+                <w:strike w:val="false"/>
+                <w:sz w:val="22"/>
+                <w:szCs w:val="22"/>
+                <w:color w:val="000000"/>
+              </w:rPr>
+            </w:pPr>
+            <w:r>
+              <w:rPr>
+                <w:rFonts w:ascii="DejaVu Sans" w:hAnsi="DejaVu Sans" w:eastAsia="DejaVu Sans" w:cs="DejaVu Sans"/>
+                <w:i w:val="false"/>
+                <w:b w:val="false"/>
+                <w:u w:val="none"/>
+                <w:strike w:val="false"/>
+                <w:sz w:val="22"/>
+                <w:szCs w:val="22"/>
+                <w:color w:val="000000"/>
+              </w:rPr>
+              <w:t xml:space="preserve">8.5%</w:t>
             </w:r>
           </w:p>
         </w:tc>
@@ -8516,7 +8733,7 @@
                 <w:szCs w:val="22"/>
                 <w:color w:val="000000"/>
               </w:rPr>
-              <w:t xml:space="preserve">33.2%</w:t>
+              <w:t xml:space="preserve">34.3%</w:t>
             </w:r>
           </w:p>
         </w:tc>
@@ -8570,7 +8787,7 @@
                 <w:szCs w:val="22"/>
                 <w:color w:val="000000"/>
               </w:rPr>
-              <w:t xml:space="preserve">33.7%</w:t>
+              <w:t xml:space="preserve">35.1%</w:t>
             </w:r>
           </w:p>
         </w:tc>
@@ -8624,7 +8841,7 @@
                 <w:szCs w:val="22"/>
                 <w:color w:val="000000"/>
               </w:rPr>
-              <w:t xml:space="preserve">30.2%</w:t>
+              <w:t xml:space="preserve">31.2%</w:t>
             </w:r>
           </w:p>
         </w:tc>
@@ -8678,7 +8895,7 @@
                 <w:szCs w:val="22"/>
                 <w:color w:val="000000"/>
               </w:rPr>
-              <w:t xml:space="preserve">27.8%</w:t>
+              <w:t xml:space="preserve">28.9%</w:t>
             </w:r>
           </w:p>
         </w:tc>
@@ -8732,7 +8949,61 @@
                 <w:szCs w:val="22"/>
                 <w:color w:val="000000"/>
               </w:rPr>
-              <w:t xml:space="preserve">29.5%</w:t>
+              <w:t xml:space="preserve">27.6%</w:t>
+            </w:r>
+          </w:p>
+        </w:tc>
+        <w:tc>
+          <w:tcPr>
+            <w:tcBorders>
+              <w:bottom w:val="none" w:sz="0" w:space="0" w:color="000000"/>
+              <w:top w:val="none" w:sz="0" w:space="0" w:color="000000"/>
+              <w:left w:val="none" w:sz="0" w:space="0" w:color="000000"/>
+              <w:right w:val="none" w:sz="0" w:space="0" w:color="000000"/>
+            </w:tcBorders>
+            <w:shd w:val="clear" w:color="auto" w:fill="FFFFFF"/>
+            <w:tcMar>
+              <w:top w:w="0" w:type="dxa"/>
+              <w:bottom w:w="0" w:type="dxa"/>
+              <w:left w:w="0" w:type="dxa"/>
+              <w:right w:w="0" w:type="dxa"/>
+            </w:tcMar>
+            <w:vAlign w:val="center"/>
+          </w:tcPr>
+          <w:p>
+            <w:pPr>
+              <w:jc w:val="center"/>
+              <w:pBdr>
+                <w:bottom w:val="none" w:sz="0" w:space="0" w:color="000000"/>
+                <w:top w:val="none" w:sz="0" w:space="0" w:color="000000"/>
+                <w:left w:val="none" w:sz="0" w:space="0" w:color="000000"/>
+                <w:right w:val="none" w:sz="0" w:space="0" w:color="000000"/>
+              </w:pBdr>
+              <w:spacing w:after="100" w:before="100" w:line="240"/>
+              <w:ind w:left="100" w:right="100" w:firstLine="0" w:firstLineChars="0"/>
+              <w:rPr>
+                <w:rFonts w:ascii="DejaVu Sans" w:hAnsi="DejaVu Sans" w:eastAsia="DejaVu Sans" w:cs="DejaVu Sans"/>
+                <w:i w:val="false"/>
+                <w:b w:val="false"/>
+                <w:u w:val="none"/>
+                <w:strike w:val="false"/>
+                <w:sz w:val="22"/>
+                <w:szCs w:val="22"/>
+                <w:color w:val="000000"/>
+              </w:rPr>
+            </w:pPr>
+            <w:r>
+              <w:rPr>
+                <w:rFonts w:ascii="DejaVu Sans" w:hAnsi="DejaVu Sans" w:eastAsia="DejaVu Sans" w:cs="DejaVu Sans"/>
+                <w:i w:val="false"/>
+                <w:b w:val="false"/>
+                <w:u w:val="none"/>
+                <w:strike w:val="false"/>
+                <w:sz w:val="22"/>
+                <w:szCs w:val="22"/>
+                <w:color w:val="000000"/>
+              </w:rPr>
+              <w:t xml:space="preserve">29.2%</w:t>
             </w:r>
           </w:p>
         </w:tc>
@@ -8845,7 +9116,7 @@
                 <w:szCs w:val="22"/>
                 <w:color w:val="000000"/>
               </w:rPr>
-              <w:t xml:space="preserve">34.4%</w:t>
+              <w:t xml:space="preserve">34.5%</w:t>
             </w:r>
           </w:p>
         </w:tc>
@@ -8899,7 +9170,7 @@
                 <w:szCs w:val="22"/>
                 <w:color w:val="000000"/>
               </w:rPr>
-              <w:t xml:space="preserve">30.3%</w:t>
+              <w:t xml:space="preserve">30.2%</w:t>
             </w:r>
           </w:p>
         </w:tc>
@@ -8953,7 +9224,7 @@
                 <w:szCs w:val="22"/>
                 <w:color w:val="000000"/>
               </w:rPr>
-              <w:t xml:space="preserve">34.8%</w:t>
+              <w:t xml:space="preserve">32.3%</w:t>
             </w:r>
           </w:p>
         </w:tc>
@@ -9007,7 +9278,61 @@
                 <w:szCs w:val="22"/>
                 <w:color w:val="000000"/>
               </w:rPr>
-              <w:t xml:space="preserve">34.6%</w:t>
+              <w:t xml:space="preserve">36.3%</w:t>
+            </w:r>
+          </w:p>
+        </w:tc>
+        <w:tc>
+          <w:tcPr>
+            <w:tcBorders>
+              <w:bottom w:val="none" w:sz="0" w:space="0" w:color="000000"/>
+              <w:top w:val="none" w:sz="0" w:space="0" w:color="000000"/>
+              <w:left w:val="none" w:sz="0" w:space="0" w:color="000000"/>
+              <w:right w:val="none" w:sz="0" w:space="0" w:color="000000"/>
+            </w:tcBorders>
+            <w:shd w:val="clear" w:color="auto" w:fill="FFFFFF"/>
+            <w:tcMar>
+              <w:top w:w="0" w:type="dxa"/>
+              <w:bottom w:w="0" w:type="dxa"/>
+              <w:left w:w="0" w:type="dxa"/>
+              <w:right w:w="0" w:type="dxa"/>
+            </w:tcMar>
+            <w:vAlign w:val="center"/>
+          </w:tcPr>
+          <w:p>
+            <w:pPr>
+              <w:jc w:val="center"/>
+              <w:pBdr>
+                <w:bottom w:val="none" w:sz="0" w:space="0" w:color="000000"/>
+                <w:top w:val="none" w:sz="0" w:space="0" w:color="000000"/>
+                <w:left w:val="none" w:sz="0" w:space="0" w:color="000000"/>
+                <w:right w:val="none" w:sz="0" w:space="0" w:color="000000"/>
+              </w:pBdr>
+              <w:spacing w:after="100" w:before="100" w:line="240"/>
+              <w:ind w:left="100" w:right="100" w:firstLine="0" w:firstLineChars="0"/>
+              <w:rPr>
+                <w:rFonts w:ascii="DejaVu Sans" w:hAnsi="DejaVu Sans" w:eastAsia="DejaVu Sans" w:cs="DejaVu Sans"/>
+                <w:i w:val="false"/>
+                <w:b w:val="false"/>
+                <w:u w:val="none"/>
+                <w:strike w:val="false"/>
+                <w:sz w:val="22"/>
+                <w:szCs w:val="22"/>
+                <w:color w:val="000000"/>
+              </w:rPr>
+            </w:pPr>
+            <w:r>
+              <w:rPr>
+                <w:rFonts w:ascii="DejaVu Sans" w:hAnsi="DejaVu Sans" w:eastAsia="DejaVu Sans" w:cs="DejaVu Sans"/>
+                <w:i w:val="false"/>
+                <w:b w:val="false"/>
+                <w:u w:val="none"/>
+                <w:strike w:val="false"/>
+                <w:sz w:val="22"/>
+                <w:szCs w:val="22"/>
+                <w:color w:val="000000"/>
+              </w:rPr>
+              <w:t xml:space="preserve">34.2%</w:t>
             </w:r>
           </w:p>
         </w:tc>
@@ -9174,7 +9499,7 @@
                 <w:szCs w:val="22"/>
                 <w:color w:val="000000"/>
               </w:rPr>
-              <w:t xml:space="preserve">14.2%</w:t>
+              <w:t xml:space="preserve">12.3%</w:t>
             </w:r>
           </w:p>
         </w:tc>
@@ -9228,7 +9553,7 @@
                 <w:szCs w:val="22"/>
                 <w:color w:val="000000"/>
               </w:rPr>
-              <w:t xml:space="preserve">19.1%</w:t>
+              <w:t xml:space="preserve">18.2%</w:t>
             </w:r>
           </w:p>
         </w:tc>
@@ -9282,7 +9607,7 @@
                 <w:szCs w:val="22"/>
                 <w:color w:val="000000"/>
               </w:rPr>
-              <w:t xml:space="preserve">18.8%</w:t>
+              <w:t xml:space="preserve">19.4%</w:t>
             </w:r>
           </w:p>
         </w:tc>
@@ -9336,7 +9661,7 @@
                 <w:szCs w:val="22"/>
                 <w:color w:val="000000"/>
               </w:rPr>
-              <w:t xml:space="preserve">24.4%</w:t>
+              <w:t xml:space="preserve">19.5%</w:t>
             </w:r>
           </w:p>
         </w:tc>
@@ -9390,22 +9715,66 @@
                 <w:szCs w:val="22"/>
                 <w:color w:val="000000"/>
               </w:rPr>
-              <w:t xml:space="preserve">28.6%</w:t>
+              <w:t xml:space="preserve">25.5%</w:t>
+            </w:r>
+          </w:p>
+        </w:tc>
+        <w:tc>
+          <w:tcPr>
+            <w:tcBorders>
+              <w:bottom w:val="single" w:sz="12" w:space="0" w:color="666666"/>
+              <w:top w:val="none" w:sz="0" w:space="0" w:color="000000"/>
+              <w:left w:val="none" w:sz="0" w:space="0" w:color="000000"/>
+              <w:right w:val="none" w:sz="0" w:space="0" w:color="000000"/>
+            </w:tcBorders>
+            <w:shd w:val="clear" w:color="auto" w:fill="FFFFFF"/>
+            <w:tcMar>
+              <w:top w:w="0" w:type="dxa"/>
+              <w:bottom w:w="0" w:type="dxa"/>
+              <w:left w:w="0" w:type="dxa"/>
+              <w:right w:w="0" w:type="dxa"/>
+            </w:tcMar>
+            <w:vAlign w:val="center"/>
+          </w:tcPr>
+          <w:p>
+            <w:pPr>
+              <w:jc w:val="center"/>
+              <w:pBdr>
+                <w:bottom w:val="none" w:sz="0" w:space="0" w:color="000000"/>
+                <w:top w:val="none" w:sz="0" w:space="0" w:color="000000"/>
+                <w:left w:val="none" w:sz="0" w:space="0" w:color="000000"/>
+                <w:right w:val="none" w:sz="0" w:space="0" w:color="000000"/>
+              </w:pBdr>
+              <w:spacing w:after="100" w:before="100" w:line="240"/>
+              <w:ind w:left="100" w:right="100" w:firstLine="0" w:firstLineChars="0"/>
+              <w:rPr>
+                <w:rFonts w:ascii="DejaVu Sans" w:hAnsi="DejaVu Sans" w:eastAsia="DejaVu Sans" w:cs="DejaVu Sans"/>
+                <w:i w:val="false"/>
+                <w:b w:val="false"/>
+                <w:u w:val="none"/>
+                <w:strike w:val="false"/>
+                <w:sz w:val="22"/>
+                <w:szCs w:val="22"/>
+                <w:color w:val="000000"/>
+              </w:rPr>
+            </w:pPr>
+            <w:r>
+              <w:rPr>
+                <w:rFonts w:ascii="DejaVu Sans" w:hAnsi="DejaVu Sans" w:eastAsia="DejaVu Sans" w:cs="DejaVu Sans"/>
+                <w:i w:val="false"/>
+                <w:b w:val="false"/>
+                <w:u w:val="none"/>
+                <w:strike w:val="false"/>
+                <w:sz w:val="22"/>
+                <w:szCs w:val="22"/>
+                <w:color w:val="000000"/>
+              </w:rPr>
+              <w:t xml:space="preserve">29.0%</w:t>
             </w:r>
           </w:p>
         </w:tc>
       </w:tr>
     </w:tbl>
-    <w:bookmarkEnd w:id="26"/>
-    <w:bookmarkStart w:id="27" w:name="done"/>
-    <w:p>
-      <w:pPr>
-        <w:pStyle w:val="Heading1"/>
-      </w:pPr>
-      <w:r>
-        <w:t xml:space="preserve">Done</w:t>
-      </w:r>
-    </w:p>
     <w:tbl xmlns:w14="http://schemas.microsoft.com/office/word/2010/wordml">
       <w:tblPr>
         <w:tblLayout w:type="fixed"/>
@@ -9748,7 +10117,7 @@
                 <w:szCs w:val="22"/>
                 <w:color w:val="000000"/>
               </w:rPr>
-              <w:t xml:space="preserve">44.8</w:t>
+              <w:t xml:space="preserve">51.2</w:t>
             </w:r>
           </w:p>
         </w:tc>
@@ -9802,7 +10171,7 @@
                 <w:szCs w:val="22"/>
                 <w:color w:val="000000"/>
               </w:rPr>
-              <w:t xml:space="preserve">183.4</w:t>
+              <w:t xml:space="preserve">201.4</w:t>
             </w:r>
           </w:p>
         </w:tc>
@@ -9856,7 +10225,7 @@
                 <w:szCs w:val="22"/>
                 <w:color w:val="000000"/>
               </w:rPr>
-              <w:t xml:space="preserve">39.0</w:t>
+              <w:t xml:space="preserve">21.4</w:t>
             </w:r>
           </w:p>
         </w:tc>
@@ -9969,7 +10338,7 @@
                 <w:szCs w:val="22"/>
                 <w:color w:val="000000"/>
               </w:rPr>
-              <w:t xml:space="preserve">100.1</w:t>
+              <w:t xml:space="preserve">102.3</w:t>
             </w:r>
           </w:p>
         </w:tc>
@@ -10077,7 +10446,7 @@
                 <w:szCs w:val="22"/>
                 <w:color w:val="000000"/>
               </w:rPr>
-              <w:t xml:space="preserve">64.7</w:t>
+              <w:t xml:space="preserve">42.6</w:t>
             </w:r>
           </w:p>
         </w:tc>
@@ -10190,7 +10559,7 @@
                 <w:szCs w:val="22"/>
                 <w:color w:val="000000"/>
               </w:rPr>
-              <w:t xml:space="preserve">181.2</w:t>
+              <w:t xml:space="preserve">317.9</w:t>
             </w:r>
           </w:p>
         </w:tc>
@@ -10244,7 +10613,7 @@
                 <w:szCs w:val="22"/>
                 <w:color w:val="000000"/>
               </w:rPr>
-              <w:t xml:space="preserve">555.0</w:t>
+              <w:t xml:space="preserve">691.6</w:t>
             </w:r>
           </w:p>
         </w:tc>
@@ -10298,7 +10667,7 @@
                 <w:szCs w:val="22"/>
                 <w:color w:val="000000"/>
               </w:rPr>
-              <w:t xml:space="preserve">83.6</w:t>
+              <w:t xml:space="preserve">61.7</w:t>
             </w:r>
           </w:p>
         </w:tc>
@@ -10357,7 +10726,7 @@
                 <w:szCs w:val="22"/>
                 <w:color w:val="000000"/>
               </w:rPr>
-              <w:t xml:space="preserve">Completed: Preprocessing</w:t>
+              <w:t xml:space="preserve">Preprocessing completed</w:t>
             </w:r>
           </w:p>
         </w:tc>
@@ -10411,7 +10780,7 @@
                 <w:szCs w:val="22"/>
                 <w:color w:val="000000"/>
               </w:rPr>
-              <w:t xml:space="preserve">1,563.6</w:t>
+              <w:t xml:space="preserve">1,694.0</w:t>
             </w:r>
           </w:p>
         </w:tc>
@@ -10465,7 +10834,7 @@
                 <w:szCs w:val="22"/>
                 <w:color w:val="000000"/>
               </w:rPr>
-              <w:t xml:space="preserve">3,926.3</w:t>
+              <w:t xml:space="preserve">5,164.4</w:t>
             </w:r>
           </w:p>
         </w:tc>
@@ -10519,7 +10888,7 @@
                 <w:szCs w:val="22"/>
                 <w:color w:val="000000"/>
               </w:rPr>
-              <w:t xml:space="preserve">120.2</w:t>
+              <w:t xml:space="preserve">109.2</w:t>
             </w:r>
           </w:p>
         </w:tc>
@@ -10578,7 +10947,7 @@
                 <w:szCs w:val="22"/>
                 <w:color w:val="000000"/>
               </w:rPr>
-              <w:t xml:space="preserve">Plot_1</w:t>
+              <w:t xml:space="preserve">1</w:t>
             </w:r>
           </w:p>
         </w:tc>
@@ -10632,7 +11001,7 @@
                 <w:szCs w:val="22"/>
                 <w:color w:val="000000"/>
               </w:rPr>
-              <w:t xml:space="preserve">473.0</w:t>
+              <w:t xml:space="preserve">322.2</w:t>
             </w:r>
           </w:p>
         </w:tc>
@@ -10686,7 +11055,7 @@
                 <w:szCs w:val="22"/>
                 <w:color w:val="000000"/>
               </w:rPr>
-              <w:t xml:space="preserve">263.6</w:t>
+              <w:t xml:space="preserve">1.2</w:t>
             </w:r>
           </w:p>
         </w:tc>
@@ -10740,7 +11109,7 @@
                 <w:szCs w:val="22"/>
                 <w:color w:val="000000"/>
               </w:rPr>
-              <w:t xml:space="preserve">17.1</w:t>
+              <w:t xml:space="preserve">0.5</w:t>
             </w:r>
           </w:p>
         </w:tc>
@@ -10799,7 +11168,7 @@
                 <w:szCs w:val="22"/>
                 <w:color w:val="000000"/>
               </w:rPr>
-              <w:t xml:space="preserve">Plot_2</w:t>
+              <w:t xml:space="preserve">2</w:t>
             </w:r>
           </w:p>
         </w:tc>
@@ -10853,7 +11222,7 @@
                 <w:szCs w:val="22"/>
                 <w:color w:val="000000"/>
               </w:rPr>
-              <w:t xml:space="preserve">1,189.0</w:t>
+              <w:t xml:space="preserve">321.2</w:t>
             </w:r>
           </w:p>
         </w:tc>
@@ -10907,7 +11276,7 @@
                 <w:szCs w:val="22"/>
                 <w:color w:val="000000"/>
               </w:rPr>
-              <w:t xml:space="preserve">995.7</w:t>
+              <w:t xml:space="preserve">0.0</w:t>
             </w:r>
           </w:p>
         </w:tc>
@@ -10961,7 +11330,7 @@
                 <w:szCs w:val="22"/>
                 <w:color w:val="000000"/>
               </w:rPr>
-              <w:t xml:space="preserve">5.2</w:t>
+              <w:t xml:space="preserve">0.5</w:t>
             </w:r>
           </w:p>
         </w:tc>
@@ -11020,7 +11389,7 @@
                 <w:szCs w:val="22"/>
                 <w:color w:val="000000"/>
               </w:rPr>
-              <w:t xml:space="preserve">Plot_3</w:t>
+              <w:t xml:space="preserve">3</w:t>
             </w:r>
           </w:p>
         </w:tc>
@@ -11074,7 +11443,7 @@
                 <w:szCs w:val="22"/>
                 <w:color w:val="000000"/>
               </w:rPr>
-              <w:t xml:space="preserve">1,181.0</w:t>
+              <w:t xml:space="preserve">577.5</w:t>
             </w:r>
           </w:p>
         </w:tc>
@@ -11128,7 +11497,7 @@
                 <w:szCs w:val="22"/>
                 <w:color w:val="000000"/>
               </w:rPr>
-              <w:t xml:space="preserve">987.1</w:t>
+              <w:t xml:space="preserve">239.7</w:t>
             </w:r>
           </w:p>
         </w:tc>
@@ -11182,7 +11551,7 @@
                 <w:szCs w:val="22"/>
                 <w:color w:val="000000"/>
               </w:rPr>
-              <w:t xml:space="preserve">5.2</w:t>
+              <w:t xml:space="preserve">14.4</w:t>
             </w:r>
           </w:p>
         </w:tc>
@@ -11241,7 +11610,7 @@
                 <w:szCs w:val="22"/>
                 <w:color w:val="000000"/>
               </w:rPr>
-              <w:t xml:space="preserve">Save_1</w:t>
+              <w:t xml:space="preserve">4</w:t>
             </w:r>
           </w:p>
         </w:tc>
@@ -11295,7 +11664,7 @@
                 <w:szCs w:val="22"/>
                 <w:color w:val="000000"/>
               </w:rPr>
-              <w:t xml:space="preserve">1,189.5</w:t>
+              <w:t xml:space="preserve">357.6</w:t>
             </w:r>
           </w:p>
         </w:tc>
@@ -11349,7 +11718,7 @@
                 <w:szCs w:val="22"/>
                 <w:color w:val="000000"/>
               </w:rPr>
-              <w:t xml:space="preserve">998.5</w:t>
+              <w:t xml:space="preserve">35.1</w:t>
             </w:r>
           </w:p>
         </w:tc>
@@ -11403,7 +11772,7 @@
                 <w:szCs w:val="22"/>
                 <w:color w:val="000000"/>
               </w:rPr>
-              <w:t xml:space="preserve">2.9</w:t>
+              <w:t xml:space="preserve">1.3</w:t>
             </w:r>
           </w:p>
         </w:tc>
@@ -11462,7 +11831,7 @@
                 <w:szCs w:val="22"/>
                 <w:color w:val="000000"/>
               </w:rPr>
-              <w:t xml:space="preserve">Save_2</w:t>
+              <w:t xml:space="preserve">5</w:t>
             </w:r>
           </w:p>
         </w:tc>
@@ -11516,7 +11885,7 @@
                 <w:szCs w:val="22"/>
                 <w:color w:val="000000"/>
               </w:rPr>
-              <w:t xml:space="preserve">1,563.6</w:t>
+              <w:t xml:space="preserve">1,026.5</w:t>
             </w:r>
           </w:p>
         </w:tc>
@@ -11570,7 +11939,7 @@
                 <w:szCs w:val="22"/>
                 <w:color w:val="000000"/>
               </w:rPr>
-              <w:t xml:space="preserve">1,371.7</w:t>
+              <w:t xml:space="preserve">698.7</w:t>
             </w:r>
           </w:p>
         </w:tc>
@@ -11624,7 +11993,1554 @@
                 <w:szCs w:val="22"/>
                 <w:color w:val="000000"/>
               </w:rPr>
+              <w:t xml:space="preserve">3.6</w:t>
+            </w:r>
+          </w:p>
+        </w:tc>
+      </w:tr>
+      <w:tr>
+        <w:trPr>
+          <w:trHeight w:val="608" w:hRule="auto"/>
+        </w:trPr>
+        <w:tc>
+          <w:tcPr>
+            <w:tcBorders>
+              <w:bottom w:val="none" w:sz="0" w:space="0" w:color="000000"/>
+              <w:top w:val="none" w:sz="0" w:space="0" w:color="000000"/>
+              <w:left w:val="none" w:sz="0" w:space="0" w:color="000000"/>
+              <w:right w:val="none" w:sz="0" w:space="0" w:color="000000"/>
+            </w:tcBorders>
+            <w:shd w:val="clear" w:color="auto" w:fill="FFFFFF"/>
+            <w:tcMar>
+              <w:top w:w="0" w:type="dxa"/>
+              <w:bottom w:w="0" w:type="dxa"/>
+              <w:left w:w="0" w:type="dxa"/>
+              <w:right w:w="0" w:type="dxa"/>
+            </w:tcMar>
+            <w:vAlign w:val="center"/>
+          </w:tcPr>
+          <w:p>
+            <w:pPr>
+              <w:jc w:val="left"/>
+              <w:pBdr>
+                <w:bottom w:val="none" w:sz="0" w:space="0" w:color="000000"/>
+                <w:top w:val="none" w:sz="0" w:space="0" w:color="000000"/>
+                <w:left w:val="none" w:sz="0" w:space="0" w:color="000000"/>
+                <w:right w:val="none" w:sz="0" w:space="0" w:color="000000"/>
+              </w:pBdr>
+              <w:spacing w:after="100" w:before="100" w:line="240"/>
+              <w:ind w:left="100" w:right="100" w:firstLine="0" w:firstLineChars="0"/>
+              <w:rPr>
+                <w:rFonts w:ascii="DejaVu Sans" w:hAnsi="DejaVu Sans" w:eastAsia="DejaVu Sans" w:cs="DejaVu Sans"/>
+                <w:i w:val="false"/>
+                <w:b w:val="false"/>
+                <w:u w:val="none"/>
+                <w:strike w:val="false"/>
+                <w:sz w:val="22"/>
+                <w:szCs w:val="22"/>
+                <w:color w:val="000000"/>
+              </w:rPr>
+            </w:pPr>
+            <w:r>
+              <w:rPr>
+                <w:rFonts w:ascii="DejaVu Sans" w:hAnsi="DejaVu Sans" w:eastAsia="DejaVu Sans" w:cs="DejaVu Sans"/>
+                <w:i w:val="false"/>
+                <w:b w:val="false"/>
+                <w:u w:val="none"/>
+                <w:strike w:val="false"/>
+                <w:sz w:val="22"/>
+                <w:szCs w:val="22"/>
+                <w:color w:val="000000"/>
+              </w:rPr>
+              <w:t xml:space="preserve">6</w:t>
+            </w:r>
+          </w:p>
+        </w:tc>
+        <w:tc>
+          <w:tcPr>
+            <w:tcBorders>
+              <w:bottom w:val="none" w:sz="0" w:space="0" w:color="000000"/>
+              <w:top w:val="none" w:sz="0" w:space="0" w:color="000000"/>
+              <w:left w:val="none" w:sz="0" w:space="0" w:color="000000"/>
+              <w:right w:val="none" w:sz="0" w:space="0" w:color="000000"/>
+            </w:tcBorders>
+            <w:shd w:val="clear" w:color="auto" w:fill="FFFFFF"/>
+            <w:tcMar>
+              <w:top w:w="0" w:type="dxa"/>
+              <w:bottom w:w="0" w:type="dxa"/>
+              <w:left w:w="0" w:type="dxa"/>
+              <w:right w:w="0" w:type="dxa"/>
+            </w:tcMar>
+            <w:vAlign w:val="center"/>
+          </w:tcPr>
+          <w:p>
+            <w:pPr>
+              <w:jc w:val="right"/>
+              <w:pBdr>
+                <w:bottom w:val="none" w:sz="0" w:space="0" w:color="000000"/>
+                <w:top w:val="none" w:sz="0" w:space="0" w:color="000000"/>
+                <w:left w:val="none" w:sz="0" w:space="0" w:color="000000"/>
+                <w:right w:val="none" w:sz="0" w:space="0" w:color="000000"/>
+              </w:pBdr>
+              <w:spacing w:after="100" w:before="100" w:line="240"/>
+              <w:ind w:left="100" w:right="100" w:firstLine="0" w:firstLineChars="0"/>
+              <w:rPr>
+                <w:rFonts w:ascii="DejaVu Sans" w:hAnsi="DejaVu Sans" w:eastAsia="DejaVu Sans" w:cs="DejaVu Sans"/>
+                <w:i w:val="false"/>
+                <w:b w:val="false"/>
+                <w:u w:val="none"/>
+                <w:strike w:val="false"/>
+                <w:sz w:val="22"/>
+                <w:szCs w:val="22"/>
+                <w:color w:val="000000"/>
+              </w:rPr>
+            </w:pPr>
+            <w:r>
+              <w:rPr>
+                <w:rFonts w:ascii="DejaVu Sans" w:hAnsi="DejaVu Sans" w:eastAsia="DejaVu Sans" w:cs="DejaVu Sans"/>
+                <w:i w:val="false"/>
+                <w:b w:val="false"/>
+                <w:u w:val="none"/>
+                <w:strike w:val="false"/>
+                <w:sz w:val="22"/>
+                <w:szCs w:val="22"/>
+                <w:color w:val="000000"/>
+              </w:rPr>
+              <w:t xml:space="preserve">1,124.7</w:t>
+            </w:r>
+          </w:p>
+        </w:tc>
+        <w:tc>
+          <w:tcPr>
+            <w:tcBorders>
+              <w:bottom w:val="none" w:sz="0" w:space="0" w:color="000000"/>
+              <w:top w:val="none" w:sz="0" w:space="0" w:color="000000"/>
+              <w:left w:val="none" w:sz="0" w:space="0" w:color="000000"/>
+              <w:right w:val="none" w:sz="0" w:space="0" w:color="000000"/>
+            </w:tcBorders>
+            <w:shd w:val="clear" w:color="auto" w:fill="FFFFFF"/>
+            <w:tcMar>
+              <w:top w:w="0" w:type="dxa"/>
+              <w:bottom w:w="0" w:type="dxa"/>
+              <w:left w:w="0" w:type="dxa"/>
+              <w:right w:w="0" w:type="dxa"/>
+            </w:tcMar>
+            <w:vAlign w:val="center"/>
+          </w:tcPr>
+          <w:p>
+            <w:pPr>
+              <w:jc w:val="right"/>
+              <w:pBdr>
+                <w:bottom w:val="none" w:sz="0" w:space="0" w:color="000000"/>
+                <w:top w:val="none" w:sz="0" w:space="0" w:color="000000"/>
+                <w:left w:val="none" w:sz="0" w:space="0" w:color="000000"/>
+                <w:right w:val="none" w:sz="0" w:space="0" w:color="000000"/>
+              </w:pBdr>
+              <w:spacing w:after="100" w:before="100" w:line="240"/>
+              <w:ind w:left="100" w:right="100" w:firstLine="0" w:firstLineChars="0"/>
+              <w:rPr>
+                <w:rFonts w:ascii="DejaVu Sans" w:hAnsi="DejaVu Sans" w:eastAsia="DejaVu Sans" w:cs="DejaVu Sans"/>
+                <w:i w:val="false"/>
+                <w:b w:val="false"/>
+                <w:u w:val="none"/>
+                <w:strike w:val="false"/>
+                <w:sz w:val="22"/>
+                <w:szCs w:val="22"/>
+                <w:color w:val="000000"/>
+              </w:rPr>
+            </w:pPr>
+            <w:r>
+              <w:rPr>
+                <w:rFonts w:ascii="DejaVu Sans" w:hAnsi="DejaVu Sans" w:eastAsia="DejaVu Sans" w:cs="DejaVu Sans"/>
+                <w:i w:val="false"/>
+                <w:b w:val="false"/>
+                <w:u w:val="none"/>
+                <w:strike w:val="false"/>
+                <w:sz w:val="22"/>
+                <w:szCs w:val="22"/>
+                <w:color w:val="000000"/>
+              </w:rPr>
+              <w:t xml:space="preserve">799.9</w:t>
+            </w:r>
+          </w:p>
+        </w:tc>
+        <w:tc>
+          <w:tcPr>
+            <w:tcBorders>
+              <w:bottom w:val="none" w:sz="0" w:space="0" w:color="000000"/>
+              <w:top w:val="none" w:sz="0" w:space="0" w:color="000000"/>
+              <w:left w:val="none" w:sz="0" w:space="0" w:color="000000"/>
+              <w:right w:val="none" w:sz="0" w:space="0" w:color="000000"/>
+            </w:tcBorders>
+            <w:shd w:val="clear" w:color="auto" w:fill="FFFFFF"/>
+            <w:tcMar>
+              <w:top w:w="0" w:type="dxa"/>
+              <w:bottom w:w="0" w:type="dxa"/>
+              <w:left w:w="0" w:type="dxa"/>
+              <w:right w:w="0" w:type="dxa"/>
+            </w:tcMar>
+            <w:vAlign w:val="center"/>
+          </w:tcPr>
+          <w:p>
+            <w:pPr>
+              <w:jc w:val="right"/>
+              <w:pBdr>
+                <w:bottom w:val="none" w:sz="0" w:space="0" w:color="000000"/>
+                <w:top w:val="none" w:sz="0" w:space="0" w:color="000000"/>
+                <w:left w:val="none" w:sz="0" w:space="0" w:color="000000"/>
+                <w:right w:val="none" w:sz="0" w:space="0" w:color="000000"/>
+              </w:pBdr>
+              <w:spacing w:after="100" w:before="100" w:line="240"/>
+              <w:ind w:left="100" w:right="100" w:firstLine="0" w:firstLineChars="0"/>
+              <w:rPr>
+                <w:rFonts w:ascii="DejaVu Sans" w:hAnsi="DejaVu Sans" w:eastAsia="DejaVu Sans" w:cs="DejaVu Sans"/>
+                <w:i w:val="false"/>
+                <w:b w:val="false"/>
+                <w:u w:val="none"/>
+                <w:strike w:val="false"/>
+                <w:sz w:val="22"/>
+                <w:szCs w:val="22"/>
+                <w:color w:val="000000"/>
+              </w:rPr>
+            </w:pPr>
+            <w:r>
+              <w:rPr>
+                <w:rFonts w:ascii="DejaVu Sans" w:hAnsi="DejaVu Sans" w:eastAsia="DejaVu Sans" w:cs="DejaVu Sans"/>
+                <w:i w:val="false"/>
+                <w:b w:val="false"/>
+                <w:u w:val="none"/>
+                <w:strike w:val="false"/>
+                <w:sz w:val="22"/>
+                <w:szCs w:val="22"/>
+                <w:color w:val="000000"/>
+              </w:rPr>
+              <w:t xml:space="preserve">3.0</w:t>
+            </w:r>
+          </w:p>
+        </w:tc>
+      </w:tr>
+      <w:tr>
+        <w:trPr>
+          <w:trHeight w:val="608" w:hRule="auto"/>
+        </w:trPr>
+        <w:tc>
+          <w:tcPr>
+            <w:tcBorders>
+              <w:bottom w:val="none" w:sz="0" w:space="0" w:color="000000"/>
+              <w:top w:val="none" w:sz="0" w:space="0" w:color="000000"/>
+              <w:left w:val="none" w:sz="0" w:space="0" w:color="000000"/>
+              <w:right w:val="none" w:sz="0" w:space="0" w:color="000000"/>
+            </w:tcBorders>
+            <w:shd w:val="clear" w:color="auto" w:fill="FFFFFF"/>
+            <w:tcMar>
+              <w:top w:w="0" w:type="dxa"/>
+              <w:bottom w:w="0" w:type="dxa"/>
+              <w:left w:w="0" w:type="dxa"/>
+              <w:right w:w="0" w:type="dxa"/>
+            </w:tcMar>
+            <w:vAlign w:val="center"/>
+          </w:tcPr>
+          <w:p>
+            <w:pPr>
+              <w:jc w:val="left"/>
+              <w:pBdr>
+                <w:bottom w:val="none" w:sz="0" w:space="0" w:color="000000"/>
+                <w:top w:val="none" w:sz="0" w:space="0" w:color="000000"/>
+                <w:left w:val="none" w:sz="0" w:space="0" w:color="000000"/>
+                <w:right w:val="none" w:sz="0" w:space="0" w:color="000000"/>
+              </w:pBdr>
+              <w:spacing w:after="100" w:before="100" w:line="240"/>
+              <w:ind w:left="100" w:right="100" w:firstLine="0" w:firstLineChars="0"/>
+              <w:rPr>
+                <w:rFonts w:ascii="DejaVu Sans" w:hAnsi="DejaVu Sans" w:eastAsia="DejaVu Sans" w:cs="DejaVu Sans"/>
+                <w:i w:val="false"/>
+                <w:b w:val="false"/>
+                <w:u w:val="none"/>
+                <w:strike w:val="false"/>
+                <w:sz w:val="22"/>
+                <w:szCs w:val="22"/>
+                <w:color w:val="000000"/>
+              </w:rPr>
+            </w:pPr>
+            <w:r>
+              <w:rPr>
+                <w:rFonts w:ascii="DejaVu Sans" w:hAnsi="DejaVu Sans" w:eastAsia="DejaVu Sans" w:cs="DejaVu Sans"/>
+                <w:i w:val="false"/>
+                <w:b w:val="false"/>
+                <w:u w:val="none"/>
+                <w:strike w:val="false"/>
+                <w:sz w:val="22"/>
+                <w:szCs w:val="22"/>
+                <w:color w:val="000000"/>
+              </w:rPr>
+              <w:t xml:space="preserve">7</w:t>
+            </w:r>
+          </w:p>
+        </w:tc>
+        <w:tc>
+          <w:tcPr>
+            <w:tcBorders>
+              <w:bottom w:val="none" w:sz="0" w:space="0" w:color="000000"/>
+              <w:top w:val="none" w:sz="0" w:space="0" w:color="000000"/>
+              <w:left w:val="none" w:sz="0" w:space="0" w:color="000000"/>
+              <w:right w:val="none" w:sz="0" w:space="0" w:color="000000"/>
+            </w:tcBorders>
+            <w:shd w:val="clear" w:color="auto" w:fill="FFFFFF"/>
+            <w:tcMar>
+              <w:top w:w="0" w:type="dxa"/>
+              <w:bottom w:w="0" w:type="dxa"/>
+              <w:left w:w="0" w:type="dxa"/>
+              <w:right w:w="0" w:type="dxa"/>
+            </w:tcMar>
+            <w:vAlign w:val="center"/>
+          </w:tcPr>
+          <w:p>
+            <w:pPr>
+              <w:jc w:val="right"/>
+              <w:pBdr>
+                <w:bottom w:val="none" w:sz="0" w:space="0" w:color="000000"/>
+                <w:top w:val="none" w:sz="0" w:space="0" w:color="000000"/>
+                <w:left w:val="none" w:sz="0" w:space="0" w:color="000000"/>
+                <w:right w:val="none" w:sz="0" w:space="0" w:color="000000"/>
+              </w:pBdr>
+              <w:spacing w:after="100" w:before="100" w:line="240"/>
+              <w:ind w:left="100" w:right="100" w:firstLine="0" w:firstLineChars="0"/>
+              <w:rPr>
+                <w:rFonts w:ascii="DejaVu Sans" w:hAnsi="DejaVu Sans" w:eastAsia="DejaVu Sans" w:cs="DejaVu Sans"/>
+                <w:i w:val="false"/>
+                <w:b w:val="false"/>
+                <w:u w:val="none"/>
+                <w:strike w:val="false"/>
+                <w:sz w:val="22"/>
+                <w:szCs w:val="22"/>
+                <w:color w:val="000000"/>
+              </w:rPr>
+            </w:pPr>
+            <w:r>
+              <w:rPr>
+                <w:rFonts w:ascii="DejaVu Sans" w:hAnsi="DejaVu Sans" w:eastAsia="DejaVu Sans" w:cs="DejaVu Sans"/>
+                <w:i w:val="false"/>
+                <w:b w:val="false"/>
+                <w:u w:val="none"/>
+                <w:strike w:val="false"/>
+                <w:sz w:val="22"/>
+                <w:szCs w:val="22"/>
+                <w:color w:val="000000"/>
+              </w:rPr>
+              <w:t xml:space="preserve">1,028.8</w:t>
+            </w:r>
+          </w:p>
+        </w:tc>
+        <w:tc>
+          <w:tcPr>
+            <w:tcBorders>
+              <w:bottom w:val="none" w:sz="0" w:space="0" w:color="000000"/>
+              <w:top w:val="none" w:sz="0" w:space="0" w:color="000000"/>
+              <w:left w:val="none" w:sz="0" w:space="0" w:color="000000"/>
+              <w:right w:val="none" w:sz="0" w:space="0" w:color="000000"/>
+            </w:tcBorders>
+            <w:shd w:val="clear" w:color="auto" w:fill="FFFFFF"/>
+            <w:tcMar>
+              <w:top w:w="0" w:type="dxa"/>
+              <w:bottom w:w="0" w:type="dxa"/>
+              <w:left w:w="0" w:type="dxa"/>
+              <w:right w:w="0" w:type="dxa"/>
+            </w:tcMar>
+            <w:vAlign w:val="center"/>
+          </w:tcPr>
+          <w:p>
+            <w:pPr>
+              <w:jc w:val="right"/>
+              <w:pBdr>
+                <w:bottom w:val="none" w:sz="0" w:space="0" w:color="000000"/>
+                <w:top w:val="none" w:sz="0" w:space="0" w:color="000000"/>
+                <w:left w:val="none" w:sz="0" w:space="0" w:color="000000"/>
+                <w:right w:val="none" w:sz="0" w:space="0" w:color="000000"/>
+              </w:pBdr>
+              <w:spacing w:after="100" w:before="100" w:line="240"/>
+              <w:ind w:left="100" w:right="100" w:firstLine="0" w:firstLineChars="0"/>
+              <w:rPr>
+                <w:rFonts w:ascii="DejaVu Sans" w:hAnsi="DejaVu Sans" w:eastAsia="DejaVu Sans" w:cs="DejaVu Sans"/>
+                <w:i w:val="false"/>
+                <w:b w:val="false"/>
+                <w:u w:val="none"/>
+                <w:strike w:val="false"/>
+                <w:sz w:val="22"/>
+                <w:szCs w:val="22"/>
+                <w:color w:val="000000"/>
+              </w:rPr>
+            </w:pPr>
+            <w:r>
+              <w:rPr>
+                <w:rFonts w:ascii="DejaVu Sans" w:hAnsi="DejaVu Sans" w:eastAsia="DejaVu Sans" w:cs="DejaVu Sans"/>
+                <w:i w:val="false"/>
+                <w:b w:val="false"/>
+                <w:u w:val="none"/>
+                <w:strike w:val="false"/>
+                <w:sz w:val="22"/>
+                <w:szCs w:val="22"/>
+                <w:color w:val="000000"/>
+              </w:rPr>
+              <w:t xml:space="preserve">700.4</w:t>
+            </w:r>
+          </w:p>
+        </w:tc>
+        <w:tc>
+          <w:tcPr>
+            <w:tcBorders>
+              <w:bottom w:val="none" w:sz="0" w:space="0" w:color="000000"/>
+              <w:top w:val="none" w:sz="0" w:space="0" w:color="000000"/>
+              <w:left w:val="none" w:sz="0" w:space="0" w:color="000000"/>
+              <w:right w:val="none" w:sz="0" w:space="0" w:color="000000"/>
+            </w:tcBorders>
+            <w:shd w:val="clear" w:color="auto" w:fill="FFFFFF"/>
+            <w:tcMar>
+              <w:top w:w="0" w:type="dxa"/>
+              <w:bottom w:w="0" w:type="dxa"/>
+              <w:left w:w="0" w:type="dxa"/>
+              <w:right w:w="0" w:type="dxa"/>
+            </w:tcMar>
+            <w:vAlign w:val="center"/>
+          </w:tcPr>
+          <w:p>
+            <w:pPr>
+              <w:jc w:val="right"/>
+              <w:pBdr>
+                <w:bottom w:val="none" w:sz="0" w:space="0" w:color="000000"/>
+                <w:top w:val="none" w:sz="0" w:space="0" w:color="000000"/>
+                <w:left w:val="none" w:sz="0" w:space="0" w:color="000000"/>
+                <w:right w:val="none" w:sz="0" w:space="0" w:color="000000"/>
+              </w:pBdr>
+              <w:spacing w:after="100" w:before="100" w:line="240"/>
+              <w:ind w:left="100" w:right="100" w:firstLine="0" w:firstLineChars="0"/>
+              <w:rPr>
+                <w:rFonts w:ascii="DejaVu Sans" w:hAnsi="DejaVu Sans" w:eastAsia="DejaVu Sans" w:cs="DejaVu Sans"/>
+                <w:i w:val="false"/>
+                <w:b w:val="false"/>
+                <w:u w:val="none"/>
+                <w:strike w:val="false"/>
+                <w:sz w:val="22"/>
+                <w:szCs w:val="22"/>
+                <w:color w:val="000000"/>
+              </w:rPr>
+            </w:pPr>
+            <w:r>
+              <w:rPr>
+                <w:rFonts w:ascii="DejaVu Sans" w:hAnsi="DejaVu Sans" w:eastAsia="DejaVu Sans" w:cs="DejaVu Sans"/>
+                <w:i w:val="false"/>
+                <w:b w:val="false"/>
+                <w:u w:val="none"/>
+                <w:strike w:val="false"/>
+                <w:sz w:val="22"/>
+                <w:szCs w:val="22"/>
+                <w:color w:val="000000"/>
+              </w:rPr>
               <w:t xml:space="preserve">3.9</w:t>
+            </w:r>
+          </w:p>
+        </w:tc>
+      </w:tr>
+      <w:tr>
+        <w:trPr>
+          <w:trHeight w:val="608" w:hRule="auto"/>
+        </w:trPr>
+        <w:tc>
+          <w:tcPr>
+            <w:tcBorders>
+              <w:bottom w:val="none" w:sz="0" w:space="0" w:color="000000"/>
+              <w:top w:val="none" w:sz="0" w:space="0" w:color="000000"/>
+              <w:left w:val="none" w:sz="0" w:space="0" w:color="000000"/>
+              <w:right w:val="none" w:sz="0" w:space="0" w:color="000000"/>
+            </w:tcBorders>
+            <w:shd w:val="clear" w:color="auto" w:fill="FFFFFF"/>
+            <w:tcMar>
+              <w:top w:w="0" w:type="dxa"/>
+              <w:bottom w:w="0" w:type="dxa"/>
+              <w:left w:w="0" w:type="dxa"/>
+              <w:right w:w="0" w:type="dxa"/>
+            </w:tcMar>
+            <w:vAlign w:val="center"/>
+          </w:tcPr>
+          <w:p>
+            <w:pPr>
+              <w:jc w:val="left"/>
+              <w:pBdr>
+                <w:bottom w:val="none" w:sz="0" w:space="0" w:color="000000"/>
+                <w:top w:val="none" w:sz="0" w:space="0" w:color="000000"/>
+                <w:left w:val="none" w:sz="0" w:space="0" w:color="000000"/>
+                <w:right w:val="none" w:sz="0" w:space="0" w:color="000000"/>
+              </w:pBdr>
+              <w:spacing w:after="100" w:before="100" w:line="240"/>
+              <w:ind w:left="100" w:right="100" w:firstLine="0" w:firstLineChars="0"/>
+              <w:rPr>
+                <w:rFonts w:ascii="DejaVu Sans" w:hAnsi="DejaVu Sans" w:eastAsia="DejaVu Sans" w:cs="DejaVu Sans"/>
+                <w:i w:val="false"/>
+                <w:b w:val="false"/>
+                <w:u w:val="none"/>
+                <w:strike w:val="false"/>
+                <w:sz w:val="22"/>
+                <w:szCs w:val="22"/>
+                <w:color w:val="000000"/>
+              </w:rPr>
+            </w:pPr>
+            <w:r>
+              <w:rPr>
+                <w:rFonts w:ascii="DejaVu Sans" w:hAnsi="DejaVu Sans" w:eastAsia="DejaVu Sans" w:cs="DejaVu Sans"/>
+                <w:i w:val="false"/>
+                <w:b w:val="false"/>
+                <w:u w:val="none"/>
+                <w:strike w:val="false"/>
+                <w:sz w:val="22"/>
+                <w:szCs w:val="22"/>
+                <w:color w:val="000000"/>
+              </w:rPr>
+              <w:t xml:space="preserve">8</w:t>
+            </w:r>
+          </w:p>
+        </w:tc>
+        <w:tc>
+          <w:tcPr>
+            <w:tcBorders>
+              <w:bottom w:val="none" w:sz="0" w:space="0" w:color="000000"/>
+              <w:top w:val="none" w:sz="0" w:space="0" w:color="000000"/>
+              <w:left w:val="none" w:sz="0" w:space="0" w:color="000000"/>
+              <w:right w:val="none" w:sz="0" w:space="0" w:color="000000"/>
+            </w:tcBorders>
+            <w:shd w:val="clear" w:color="auto" w:fill="FFFFFF"/>
+            <w:tcMar>
+              <w:top w:w="0" w:type="dxa"/>
+              <w:bottom w:w="0" w:type="dxa"/>
+              <w:left w:w="0" w:type="dxa"/>
+              <w:right w:w="0" w:type="dxa"/>
+            </w:tcMar>
+            <w:vAlign w:val="center"/>
+          </w:tcPr>
+          <w:p>
+            <w:pPr>
+              <w:jc w:val="right"/>
+              <w:pBdr>
+                <w:bottom w:val="none" w:sz="0" w:space="0" w:color="000000"/>
+                <w:top w:val="none" w:sz="0" w:space="0" w:color="000000"/>
+                <w:left w:val="none" w:sz="0" w:space="0" w:color="000000"/>
+                <w:right w:val="none" w:sz="0" w:space="0" w:color="000000"/>
+              </w:pBdr>
+              <w:spacing w:after="100" w:before="100" w:line="240"/>
+              <w:ind w:left="100" w:right="100" w:firstLine="0" w:firstLineChars="0"/>
+              <w:rPr>
+                <w:rFonts w:ascii="DejaVu Sans" w:hAnsi="DejaVu Sans" w:eastAsia="DejaVu Sans" w:cs="DejaVu Sans"/>
+                <w:i w:val="false"/>
+                <w:b w:val="false"/>
+                <w:u w:val="none"/>
+                <w:strike w:val="false"/>
+                <w:sz w:val="22"/>
+                <w:szCs w:val="22"/>
+                <w:color w:val="000000"/>
+              </w:rPr>
+            </w:pPr>
+            <w:r>
+              <w:rPr>
+                <w:rFonts w:ascii="DejaVu Sans" w:hAnsi="DejaVu Sans" w:eastAsia="DejaVu Sans" w:cs="DejaVu Sans"/>
+                <w:i w:val="false"/>
+                <w:b w:val="false"/>
+                <w:u w:val="none"/>
+                <w:strike w:val="false"/>
+                <w:sz w:val="22"/>
+                <w:szCs w:val="22"/>
+                <w:color w:val="000000"/>
+              </w:rPr>
+              <w:t xml:space="preserve">1,128.1</w:t>
+            </w:r>
+          </w:p>
+        </w:tc>
+        <w:tc>
+          <w:tcPr>
+            <w:tcBorders>
+              <w:bottom w:val="none" w:sz="0" w:space="0" w:color="000000"/>
+              <w:top w:val="none" w:sz="0" w:space="0" w:color="000000"/>
+              <w:left w:val="none" w:sz="0" w:space="0" w:color="000000"/>
+              <w:right w:val="none" w:sz="0" w:space="0" w:color="000000"/>
+            </w:tcBorders>
+            <w:shd w:val="clear" w:color="auto" w:fill="FFFFFF"/>
+            <w:tcMar>
+              <w:top w:w="0" w:type="dxa"/>
+              <w:bottom w:w="0" w:type="dxa"/>
+              <w:left w:w="0" w:type="dxa"/>
+              <w:right w:w="0" w:type="dxa"/>
+            </w:tcMar>
+            <w:vAlign w:val="center"/>
+          </w:tcPr>
+          <w:p>
+            <w:pPr>
+              <w:jc w:val="right"/>
+              <w:pBdr>
+                <w:bottom w:val="none" w:sz="0" w:space="0" w:color="000000"/>
+                <w:top w:val="none" w:sz="0" w:space="0" w:color="000000"/>
+                <w:left w:val="none" w:sz="0" w:space="0" w:color="000000"/>
+                <w:right w:val="none" w:sz="0" w:space="0" w:color="000000"/>
+              </w:pBdr>
+              <w:spacing w:after="100" w:before="100" w:line="240"/>
+              <w:ind w:left="100" w:right="100" w:firstLine="0" w:firstLineChars="0"/>
+              <w:rPr>
+                <w:rFonts w:ascii="DejaVu Sans" w:hAnsi="DejaVu Sans" w:eastAsia="DejaVu Sans" w:cs="DejaVu Sans"/>
+                <w:i w:val="false"/>
+                <w:b w:val="false"/>
+                <w:u w:val="none"/>
+                <w:strike w:val="false"/>
+                <w:sz w:val="22"/>
+                <w:szCs w:val="22"/>
+                <w:color w:val="000000"/>
+              </w:rPr>
+            </w:pPr>
+            <w:r>
+              <w:rPr>
+                <w:rFonts w:ascii="DejaVu Sans" w:hAnsi="DejaVu Sans" w:eastAsia="DejaVu Sans" w:cs="DejaVu Sans"/>
+                <w:i w:val="false"/>
+                <w:b w:val="false"/>
+                <w:u w:val="none"/>
+                <w:strike w:val="false"/>
+                <w:sz w:val="22"/>
+                <w:szCs w:val="22"/>
+                <w:color w:val="000000"/>
+              </w:rPr>
+              <w:t xml:space="preserve">803.0</w:t>
+            </w:r>
+          </w:p>
+        </w:tc>
+        <w:tc>
+          <w:tcPr>
+            <w:tcBorders>
+              <w:bottom w:val="none" w:sz="0" w:space="0" w:color="000000"/>
+              <w:top w:val="none" w:sz="0" w:space="0" w:color="000000"/>
+              <w:left w:val="none" w:sz="0" w:space="0" w:color="000000"/>
+              <w:right w:val="none" w:sz="0" w:space="0" w:color="000000"/>
+            </w:tcBorders>
+            <w:shd w:val="clear" w:color="auto" w:fill="FFFFFF"/>
+            <w:tcMar>
+              <w:top w:w="0" w:type="dxa"/>
+              <w:bottom w:w="0" w:type="dxa"/>
+              <w:left w:w="0" w:type="dxa"/>
+              <w:right w:w="0" w:type="dxa"/>
+            </w:tcMar>
+            <w:vAlign w:val="center"/>
+          </w:tcPr>
+          <w:p>
+            <w:pPr>
+              <w:jc w:val="right"/>
+              <w:pBdr>
+                <w:bottom w:val="none" w:sz="0" w:space="0" w:color="000000"/>
+                <w:top w:val="none" w:sz="0" w:space="0" w:color="000000"/>
+                <w:left w:val="none" w:sz="0" w:space="0" w:color="000000"/>
+                <w:right w:val="none" w:sz="0" w:space="0" w:color="000000"/>
+              </w:pBdr>
+              <w:spacing w:after="100" w:before="100" w:line="240"/>
+              <w:ind w:left="100" w:right="100" w:firstLine="0" w:firstLineChars="0"/>
+              <w:rPr>
+                <w:rFonts w:ascii="DejaVu Sans" w:hAnsi="DejaVu Sans" w:eastAsia="DejaVu Sans" w:cs="DejaVu Sans"/>
+                <w:i w:val="false"/>
+                <w:b w:val="false"/>
+                <w:u w:val="none"/>
+                <w:strike w:val="false"/>
+                <w:sz w:val="22"/>
+                <w:szCs w:val="22"/>
+                <w:color w:val="000000"/>
+              </w:rPr>
+            </w:pPr>
+            <w:r>
+              <w:rPr>
+                <w:rFonts w:ascii="DejaVu Sans" w:hAnsi="DejaVu Sans" w:eastAsia="DejaVu Sans" w:cs="DejaVu Sans"/>
+                <w:i w:val="false"/>
+                <w:b w:val="false"/>
+                <w:u w:val="none"/>
+                <w:strike w:val="false"/>
+                <w:sz w:val="22"/>
+                <w:szCs w:val="22"/>
+                <w:color w:val="000000"/>
+              </w:rPr>
+              <w:t xml:space="preserve">2.9</w:t>
+            </w:r>
+          </w:p>
+        </w:tc>
+      </w:tr>
+      <w:tr>
+        <w:trPr>
+          <w:trHeight w:val="608" w:hRule="auto"/>
+        </w:trPr>
+        <w:tc>
+          <w:tcPr>
+            <w:tcBorders>
+              <w:bottom w:val="none" w:sz="0" w:space="0" w:color="000000"/>
+              <w:top w:val="none" w:sz="0" w:space="0" w:color="000000"/>
+              <w:left w:val="none" w:sz="0" w:space="0" w:color="000000"/>
+              <w:right w:val="none" w:sz="0" w:space="0" w:color="000000"/>
+            </w:tcBorders>
+            <w:shd w:val="clear" w:color="auto" w:fill="FFFFFF"/>
+            <w:tcMar>
+              <w:top w:w="0" w:type="dxa"/>
+              <w:bottom w:w="0" w:type="dxa"/>
+              <w:left w:w="0" w:type="dxa"/>
+              <w:right w:w="0" w:type="dxa"/>
+            </w:tcMar>
+            <w:vAlign w:val="center"/>
+          </w:tcPr>
+          <w:p>
+            <w:pPr>
+              <w:jc w:val="left"/>
+              <w:pBdr>
+                <w:bottom w:val="none" w:sz="0" w:space="0" w:color="000000"/>
+                <w:top w:val="none" w:sz="0" w:space="0" w:color="000000"/>
+                <w:left w:val="none" w:sz="0" w:space="0" w:color="000000"/>
+                <w:right w:val="none" w:sz="0" w:space="0" w:color="000000"/>
+              </w:pBdr>
+              <w:spacing w:after="100" w:before="100" w:line="240"/>
+              <w:ind w:left="100" w:right="100" w:firstLine="0" w:firstLineChars="0"/>
+              <w:rPr>
+                <w:rFonts w:ascii="DejaVu Sans" w:hAnsi="DejaVu Sans" w:eastAsia="DejaVu Sans" w:cs="DejaVu Sans"/>
+                <w:i w:val="false"/>
+                <w:b w:val="false"/>
+                <w:u w:val="none"/>
+                <w:strike w:val="false"/>
+                <w:sz w:val="22"/>
+                <w:szCs w:val="22"/>
+                <w:color w:val="000000"/>
+              </w:rPr>
+            </w:pPr>
+            <w:r>
+              <w:rPr>
+                <w:rFonts w:ascii="DejaVu Sans" w:hAnsi="DejaVu Sans" w:eastAsia="DejaVu Sans" w:cs="DejaVu Sans"/>
+                <w:i w:val="false"/>
+                <w:b w:val="false"/>
+                <w:u w:val="none"/>
+                <w:strike w:val="false"/>
+                <w:sz w:val="22"/>
+                <w:szCs w:val="22"/>
+                <w:color w:val="000000"/>
+              </w:rPr>
+              <w:t xml:space="preserve">9</w:t>
+            </w:r>
+          </w:p>
+        </w:tc>
+        <w:tc>
+          <w:tcPr>
+            <w:tcBorders>
+              <w:bottom w:val="none" w:sz="0" w:space="0" w:color="000000"/>
+              <w:top w:val="none" w:sz="0" w:space="0" w:color="000000"/>
+              <w:left w:val="none" w:sz="0" w:space="0" w:color="000000"/>
+              <w:right w:val="none" w:sz="0" w:space="0" w:color="000000"/>
+            </w:tcBorders>
+            <w:shd w:val="clear" w:color="auto" w:fill="FFFFFF"/>
+            <w:tcMar>
+              <w:top w:w="0" w:type="dxa"/>
+              <w:bottom w:w="0" w:type="dxa"/>
+              <w:left w:w="0" w:type="dxa"/>
+              <w:right w:w="0" w:type="dxa"/>
+            </w:tcMar>
+            <w:vAlign w:val="center"/>
+          </w:tcPr>
+          <w:p>
+            <w:pPr>
+              <w:jc w:val="right"/>
+              <w:pBdr>
+                <w:bottom w:val="none" w:sz="0" w:space="0" w:color="000000"/>
+                <w:top w:val="none" w:sz="0" w:space="0" w:color="000000"/>
+                <w:left w:val="none" w:sz="0" w:space="0" w:color="000000"/>
+                <w:right w:val="none" w:sz="0" w:space="0" w:color="000000"/>
+              </w:pBdr>
+              <w:spacing w:after="100" w:before="100" w:line="240"/>
+              <w:ind w:left="100" w:right="100" w:firstLine="0" w:firstLineChars="0"/>
+              <w:rPr>
+                <w:rFonts w:ascii="DejaVu Sans" w:hAnsi="DejaVu Sans" w:eastAsia="DejaVu Sans" w:cs="DejaVu Sans"/>
+                <w:i w:val="false"/>
+                <w:b w:val="false"/>
+                <w:u w:val="none"/>
+                <w:strike w:val="false"/>
+                <w:sz w:val="22"/>
+                <w:szCs w:val="22"/>
+                <w:color w:val="000000"/>
+              </w:rPr>
+            </w:pPr>
+            <w:r>
+              <w:rPr>
+                <w:rFonts w:ascii="DejaVu Sans" w:hAnsi="DejaVu Sans" w:eastAsia="DejaVu Sans" w:cs="DejaVu Sans"/>
+                <w:i w:val="false"/>
+                <w:b w:val="false"/>
+                <w:u w:val="none"/>
+                <w:strike w:val="false"/>
+                <w:sz w:val="22"/>
+                <w:szCs w:val="22"/>
+                <w:color w:val="000000"/>
+              </w:rPr>
+              <w:t xml:space="preserve">1,389.2</w:t>
+            </w:r>
+          </w:p>
+        </w:tc>
+        <w:tc>
+          <w:tcPr>
+            <w:tcBorders>
+              <w:bottom w:val="none" w:sz="0" w:space="0" w:color="000000"/>
+              <w:top w:val="none" w:sz="0" w:space="0" w:color="000000"/>
+              <w:left w:val="none" w:sz="0" w:space="0" w:color="000000"/>
+              <w:right w:val="none" w:sz="0" w:space="0" w:color="000000"/>
+            </w:tcBorders>
+            <w:shd w:val="clear" w:color="auto" w:fill="FFFFFF"/>
+            <w:tcMar>
+              <w:top w:w="0" w:type="dxa"/>
+              <w:bottom w:w="0" w:type="dxa"/>
+              <w:left w:w="0" w:type="dxa"/>
+              <w:right w:w="0" w:type="dxa"/>
+            </w:tcMar>
+            <w:vAlign w:val="center"/>
+          </w:tcPr>
+          <w:p>
+            <w:pPr>
+              <w:jc w:val="right"/>
+              <w:pBdr>
+                <w:bottom w:val="none" w:sz="0" w:space="0" w:color="000000"/>
+                <w:top w:val="none" w:sz="0" w:space="0" w:color="000000"/>
+                <w:left w:val="none" w:sz="0" w:space="0" w:color="000000"/>
+                <w:right w:val="none" w:sz="0" w:space="0" w:color="000000"/>
+              </w:pBdr>
+              <w:spacing w:after="100" w:before="100" w:line="240"/>
+              <w:ind w:left="100" w:right="100" w:firstLine="0" w:firstLineChars="0"/>
+              <w:rPr>
+                <w:rFonts w:ascii="DejaVu Sans" w:hAnsi="DejaVu Sans" w:eastAsia="DejaVu Sans" w:cs="DejaVu Sans"/>
+                <w:i w:val="false"/>
+                <w:b w:val="false"/>
+                <w:u w:val="none"/>
+                <w:strike w:val="false"/>
+                <w:sz w:val="22"/>
+                <w:szCs w:val="22"/>
+                <w:color w:val="000000"/>
+              </w:rPr>
+            </w:pPr>
+            <w:r>
+              <w:rPr>
+                <w:rFonts w:ascii="DejaVu Sans" w:hAnsi="DejaVu Sans" w:eastAsia="DejaVu Sans" w:cs="DejaVu Sans"/>
+                <w:i w:val="false"/>
+                <w:b w:val="false"/>
+                <w:u w:val="none"/>
+                <w:strike w:val="false"/>
+                <w:sz w:val="22"/>
+                <w:szCs w:val="22"/>
+                <w:color w:val="000000"/>
+              </w:rPr>
+              <w:t xml:space="preserve">1,051.5</w:t>
+            </w:r>
+          </w:p>
+        </w:tc>
+        <w:tc>
+          <w:tcPr>
+            <w:tcBorders>
+              <w:bottom w:val="none" w:sz="0" w:space="0" w:color="000000"/>
+              <w:top w:val="none" w:sz="0" w:space="0" w:color="000000"/>
+              <w:left w:val="none" w:sz="0" w:space="0" w:color="000000"/>
+              <w:right w:val="none" w:sz="0" w:space="0" w:color="000000"/>
+            </w:tcBorders>
+            <w:shd w:val="clear" w:color="auto" w:fill="FFFFFF"/>
+            <w:tcMar>
+              <w:top w:w="0" w:type="dxa"/>
+              <w:bottom w:w="0" w:type="dxa"/>
+              <w:left w:w="0" w:type="dxa"/>
+              <w:right w:w="0" w:type="dxa"/>
+            </w:tcMar>
+            <w:vAlign w:val="center"/>
+          </w:tcPr>
+          <w:p>
+            <w:pPr>
+              <w:jc w:val="right"/>
+              <w:pBdr>
+                <w:bottom w:val="none" w:sz="0" w:space="0" w:color="000000"/>
+                <w:top w:val="none" w:sz="0" w:space="0" w:color="000000"/>
+                <w:left w:val="none" w:sz="0" w:space="0" w:color="000000"/>
+                <w:right w:val="none" w:sz="0" w:space="0" w:color="000000"/>
+              </w:pBdr>
+              <w:spacing w:after="100" w:before="100" w:line="240"/>
+              <w:ind w:left="100" w:right="100" w:firstLine="0" w:firstLineChars="0"/>
+              <w:rPr>
+                <w:rFonts w:ascii="DejaVu Sans" w:hAnsi="DejaVu Sans" w:eastAsia="DejaVu Sans" w:cs="DejaVu Sans"/>
+                <w:i w:val="false"/>
+                <w:b w:val="false"/>
+                <w:u w:val="none"/>
+                <w:strike w:val="false"/>
+                <w:sz w:val="22"/>
+                <w:szCs w:val="22"/>
+                <w:color w:val="000000"/>
+              </w:rPr>
+            </w:pPr>
+            <w:r>
+              <w:rPr>
+                <w:rFonts w:ascii="DejaVu Sans" w:hAnsi="DejaVu Sans" w:eastAsia="DejaVu Sans" w:cs="DejaVu Sans"/>
+                <w:i w:val="false"/>
+                <w:b w:val="false"/>
+                <w:u w:val="none"/>
+                <w:strike w:val="false"/>
+                <w:sz w:val="22"/>
+                <w:szCs w:val="22"/>
+                <w:color w:val="000000"/>
+              </w:rPr>
+              <w:t xml:space="preserve">6.8</w:t>
+            </w:r>
+          </w:p>
+        </w:tc>
+      </w:tr>
+      <w:tr>
+        <w:trPr>
+          <w:trHeight w:val="608" w:hRule="auto"/>
+        </w:trPr>
+        <w:tc>
+          <w:tcPr>
+            <w:tcBorders>
+              <w:bottom w:val="none" w:sz="0" w:space="0" w:color="000000"/>
+              <w:top w:val="none" w:sz="0" w:space="0" w:color="000000"/>
+              <w:left w:val="none" w:sz="0" w:space="0" w:color="000000"/>
+              <w:right w:val="none" w:sz="0" w:space="0" w:color="000000"/>
+            </w:tcBorders>
+            <w:shd w:val="clear" w:color="auto" w:fill="FFFFFF"/>
+            <w:tcMar>
+              <w:top w:w="0" w:type="dxa"/>
+              <w:bottom w:w="0" w:type="dxa"/>
+              <w:left w:w="0" w:type="dxa"/>
+              <w:right w:w="0" w:type="dxa"/>
+            </w:tcMar>
+            <w:vAlign w:val="center"/>
+          </w:tcPr>
+          <w:p>
+            <w:pPr>
+              <w:jc w:val="left"/>
+              <w:pBdr>
+                <w:bottom w:val="none" w:sz="0" w:space="0" w:color="000000"/>
+                <w:top w:val="none" w:sz="0" w:space="0" w:color="000000"/>
+                <w:left w:val="none" w:sz="0" w:space="0" w:color="000000"/>
+                <w:right w:val="none" w:sz="0" w:space="0" w:color="000000"/>
+              </w:pBdr>
+              <w:spacing w:after="100" w:before="100" w:line="240"/>
+              <w:ind w:left="100" w:right="100" w:firstLine="0" w:firstLineChars="0"/>
+              <w:rPr>
+                <w:rFonts w:ascii="DejaVu Sans" w:hAnsi="DejaVu Sans" w:eastAsia="DejaVu Sans" w:cs="DejaVu Sans"/>
+                <w:i w:val="false"/>
+                <w:b w:val="false"/>
+                <w:u w:val="none"/>
+                <w:strike w:val="false"/>
+                <w:sz w:val="22"/>
+                <w:szCs w:val="22"/>
+                <w:color w:val="000000"/>
+              </w:rPr>
+            </w:pPr>
+            <w:r>
+              <w:rPr>
+                <w:rFonts w:ascii="DejaVu Sans" w:hAnsi="DejaVu Sans" w:eastAsia="DejaVu Sans" w:cs="DejaVu Sans"/>
+                <w:i w:val="false"/>
+                <w:b w:val="false"/>
+                <w:u w:val="none"/>
+                <w:strike w:val="false"/>
+                <w:sz w:val="22"/>
+                <w:szCs w:val="22"/>
+                <w:color w:val="000000"/>
+              </w:rPr>
+              <w:t xml:space="preserve">10</w:t>
+            </w:r>
+          </w:p>
+        </w:tc>
+        <w:tc>
+          <w:tcPr>
+            <w:tcBorders>
+              <w:bottom w:val="none" w:sz="0" w:space="0" w:color="000000"/>
+              <w:top w:val="none" w:sz="0" w:space="0" w:color="000000"/>
+              <w:left w:val="none" w:sz="0" w:space="0" w:color="000000"/>
+              <w:right w:val="none" w:sz="0" w:space="0" w:color="000000"/>
+            </w:tcBorders>
+            <w:shd w:val="clear" w:color="auto" w:fill="FFFFFF"/>
+            <w:tcMar>
+              <w:top w:w="0" w:type="dxa"/>
+              <w:bottom w:w="0" w:type="dxa"/>
+              <w:left w:w="0" w:type="dxa"/>
+              <w:right w:w="0" w:type="dxa"/>
+            </w:tcMar>
+            <w:vAlign w:val="center"/>
+          </w:tcPr>
+          <w:p>
+            <w:pPr>
+              <w:jc w:val="right"/>
+              <w:pBdr>
+                <w:bottom w:val="none" w:sz="0" w:space="0" w:color="000000"/>
+                <w:top w:val="none" w:sz="0" w:space="0" w:color="000000"/>
+                <w:left w:val="none" w:sz="0" w:space="0" w:color="000000"/>
+                <w:right w:val="none" w:sz="0" w:space="0" w:color="000000"/>
+              </w:pBdr>
+              <w:spacing w:after="100" w:before="100" w:line="240"/>
+              <w:ind w:left="100" w:right="100" w:firstLine="0" w:firstLineChars="0"/>
+              <w:rPr>
+                <w:rFonts w:ascii="DejaVu Sans" w:hAnsi="DejaVu Sans" w:eastAsia="DejaVu Sans" w:cs="DejaVu Sans"/>
+                <w:i w:val="false"/>
+                <w:b w:val="false"/>
+                <w:u w:val="none"/>
+                <w:strike w:val="false"/>
+                <w:sz w:val="22"/>
+                <w:szCs w:val="22"/>
+                <w:color w:val="000000"/>
+              </w:rPr>
+            </w:pPr>
+            <w:r>
+              <w:rPr>
+                <w:rFonts w:ascii="DejaVu Sans" w:hAnsi="DejaVu Sans" w:eastAsia="DejaVu Sans" w:cs="DejaVu Sans"/>
+                <w:i w:val="false"/>
+                <w:b w:val="false"/>
+                <w:u w:val="none"/>
+                <w:strike w:val="false"/>
+                <w:sz w:val="22"/>
+                <w:szCs w:val="22"/>
+                <w:color w:val="000000"/>
+              </w:rPr>
+              <w:t xml:space="preserve">1,693.9</w:t>
+            </w:r>
+          </w:p>
+        </w:tc>
+        <w:tc>
+          <w:tcPr>
+            <w:tcBorders>
+              <w:bottom w:val="none" w:sz="0" w:space="0" w:color="000000"/>
+              <w:top w:val="none" w:sz="0" w:space="0" w:color="000000"/>
+              <w:left w:val="none" w:sz="0" w:space="0" w:color="000000"/>
+              <w:right w:val="none" w:sz="0" w:space="0" w:color="000000"/>
+            </w:tcBorders>
+            <w:shd w:val="clear" w:color="auto" w:fill="FFFFFF"/>
+            <w:tcMar>
+              <w:top w:w="0" w:type="dxa"/>
+              <w:bottom w:w="0" w:type="dxa"/>
+              <w:left w:w="0" w:type="dxa"/>
+              <w:right w:w="0" w:type="dxa"/>
+            </w:tcMar>
+            <w:vAlign w:val="center"/>
+          </w:tcPr>
+          <w:p>
+            <w:pPr>
+              <w:jc w:val="right"/>
+              <w:pBdr>
+                <w:bottom w:val="none" w:sz="0" w:space="0" w:color="000000"/>
+                <w:top w:val="none" w:sz="0" w:space="0" w:color="000000"/>
+                <w:left w:val="none" w:sz="0" w:space="0" w:color="000000"/>
+                <w:right w:val="none" w:sz="0" w:space="0" w:color="000000"/>
+              </w:pBdr>
+              <w:spacing w:after="100" w:before="100" w:line="240"/>
+              <w:ind w:left="100" w:right="100" w:firstLine="0" w:firstLineChars="0"/>
+              <w:rPr>
+                <w:rFonts w:ascii="DejaVu Sans" w:hAnsi="DejaVu Sans" w:eastAsia="DejaVu Sans" w:cs="DejaVu Sans"/>
+                <w:i w:val="false"/>
+                <w:b w:val="false"/>
+                <w:u w:val="none"/>
+                <w:strike w:val="false"/>
+                <w:sz w:val="22"/>
+                <w:szCs w:val="22"/>
+                <w:color w:val="000000"/>
+              </w:rPr>
+            </w:pPr>
+            <w:r>
+              <w:rPr>
+                <w:rFonts w:ascii="DejaVu Sans" w:hAnsi="DejaVu Sans" w:eastAsia="DejaVu Sans" w:cs="DejaVu Sans"/>
+                <w:i w:val="false"/>
+                <w:b w:val="false"/>
+                <w:u w:val="none"/>
+                <w:strike w:val="false"/>
+                <w:sz w:val="22"/>
+                <w:szCs w:val="22"/>
+                <w:color w:val="000000"/>
+              </w:rPr>
+              <w:t xml:space="preserve">1,366.3</w:t>
+            </w:r>
+          </w:p>
+        </w:tc>
+        <w:tc>
+          <w:tcPr>
+            <w:tcBorders>
+              <w:bottom w:val="none" w:sz="0" w:space="0" w:color="000000"/>
+              <w:top w:val="none" w:sz="0" w:space="0" w:color="000000"/>
+              <w:left w:val="none" w:sz="0" w:space="0" w:color="000000"/>
+              <w:right w:val="none" w:sz="0" w:space="0" w:color="000000"/>
+            </w:tcBorders>
+            <w:shd w:val="clear" w:color="auto" w:fill="FFFFFF"/>
+            <w:tcMar>
+              <w:top w:w="0" w:type="dxa"/>
+              <w:bottom w:w="0" w:type="dxa"/>
+              <w:left w:w="0" w:type="dxa"/>
+              <w:right w:w="0" w:type="dxa"/>
+            </w:tcMar>
+            <w:vAlign w:val="center"/>
+          </w:tcPr>
+          <w:p>
+            <w:pPr>
+              <w:jc w:val="right"/>
+              <w:pBdr>
+                <w:bottom w:val="none" w:sz="0" w:space="0" w:color="000000"/>
+                <w:top w:val="none" w:sz="0" w:space="0" w:color="000000"/>
+                <w:left w:val="none" w:sz="0" w:space="0" w:color="000000"/>
+                <w:right w:val="none" w:sz="0" w:space="0" w:color="000000"/>
+              </w:pBdr>
+              <w:spacing w:after="100" w:before="100" w:line="240"/>
+              <w:ind w:left="100" w:right="100" w:firstLine="0" w:firstLineChars="0"/>
+              <w:rPr>
+                <w:rFonts w:ascii="DejaVu Sans" w:hAnsi="DejaVu Sans" w:eastAsia="DejaVu Sans" w:cs="DejaVu Sans"/>
+                <w:i w:val="false"/>
+                <w:b w:val="false"/>
+                <w:u w:val="none"/>
+                <w:strike w:val="false"/>
+                <w:sz w:val="22"/>
+                <w:szCs w:val="22"/>
+                <w:color w:val="000000"/>
+              </w:rPr>
+            </w:pPr>
+            <w:r>
+              <w:rPr>
+                <w:rFonts w:ascii="DejaVu Sans" w:hAnsi="DejaVu Sans" w:eastAsia="DejaVu Sans" w:cs="DejaVu Sans"/>
+                <w:i w:val="false"/>
+                <w:b w:val="false"/>
+                <w:u w:val="none"/>
+                <w:strike w:val="false"/>
+                <w:sz w:val="22"/>
+                <w:szCs w:val="22"/>
+                <w:color w:val="000000"/>
+              </w:rPr>
+              <w:t xml:space="preserve">3.8</w:t>
+            </w:r>
+          </w:p>
+        </w:tc>
+      </w:tr>
+      <w:tr>
+        <w:trPr>
+          <w:trHeight w:val="608" w:hRule="auto"/>
+        </w:trPr>
+        <w:tc>
+          <w:tcPr>
+            <w:tcBorders>
+              <w:bottom w:val="none" w:sz="0" w:space="0" w:color="000000"/>
+              <w:top w:val="none" w:sz="0" w:space="0" w:color="000000"/>
+              <w:left w:val="none" w:sz="0" w:space="0" w:color="000000"/>
+              <w:right w:val="none" w:sz="0" w:space="0" w:color="000000"/>
+            </w:tcBorders>
+            <w:shd w:val="clear" w:color="auto" w:fill="FFFFFF"/>
+            <w:tcMar>
+              <w:top w:w="0" w:type="dxa"/>
+              <w:bottom w:w="0" w:type="dxa"/>
+              <w:left w:w="0" w:type="dxa"/>
+              <w:right w:w="0" w:type="dxa"/>
+            </w:tcMar>
+            <w:vAlign w:val="center"/>
+          </w:tcPr>
+          <w:p>
+            <w:pPr>
+              <w:jc w:val="left"/>
+              <w:pBdr>
+                <w:bottom w:val="none" w:sz="0" w:space="0" w:color="000000"/>
+                <w:top w:val="none" w:sz="0" w:space="0" w:color="000000"/>
+                <w:left w:val="none" w:sz="0" w:space="0" w:color="000000"/>
+                <w:right w:val="none" w:sz="0" w:space="0" w:color="000000"/>
+              </w:pBdr>
+              <w:spacing w:after="100" w:before="100" w:line="240"/>
+              <w:ind w:left="100" w:right="100" w:firstLine="0" w:firstLineChars="0"/>
+              <w:rPr>
+                <w:rFonts w:ascii="DejaVu Sans" w:hAnsi="DejaVu Sans" w:eastAsia="DejaVu Sans" w:cs="DejaVu Sans"/>
+                <w:i w:val="false"/>
+                <w:b w:val="false"/>
+                <w:u w:val="none"/>
+                <w:strike w:val="false"/>
+                <w:sz w:val="22"/>
+                <w:szCs w:val="22"/>
+                <w:color w:val="000000"/>
+              </w:rPr>
+            </w:pPr>
+            <w:r>
+              <w:rPr>
+                <w:rFonts w:ascii="DejaVu Sans" w:hAnsi="DejaVu Sans" w:eastAsia="DejaVu Sans" w:cs="DejaVu Sans"/>
+                <w:i w:val="false"/>
+                <w:b w:val="false"/>
+                <w:u w:val="none"/>
+                <w:strike w:val="false"/>
+                <w:sz w:val="22"/>
+                <w:szCs w:val="22"/>
+                <w:color w:val="000000"/>
+              </w:rPr>
+              <w:t xml:space="preserve">11</w:t>
+            </w:r>
+          </w:p>
+        </w:tc>
+        <w:tc>
+          <w:tcPr>
+            <w:tcBorders>
+              <w:bottom w:val="none" w:sz="0" w:space="0" w:color="000000"/>
+              <w:top w:val="none" w:sz="0" w:space="0" w:color="000000"/>
+              <w:left w:val="none" w:sz="0" w:space="0" w:color="000000"/>
+              <w:right w:val="none" w:sz="0" w:space="0" w:color="000000"/>
+            </w:tcBorders>
+            <w:shd w:val="clear" w:color="auto" w:fill="FFFFFF"/>
+            <w:tcMar>
+              <w:top w:w="0" w:type="dxa"/>
+              <w:bottom w:w="0" w:type="dxa"/>
+              <w:left w:w="0" w:type="dxa"/>
+              <w:right w:w="0" w:type="dxa"/>
+            </w:tcMar>
+            <w:vAlign w:val="center"/>
+          </w:tcPr>
+          <w:p>
+            <w:pPr>
+              <w:jc w:val="right"/>
+              <w:pBdr>
+                <w:bottom w:val="none" w:sz="0" w:space="0" w:color="000000"/>
+                <w:top w:val="none" w:sz="0" w:space="0" w:color="000000"/>
+                <w:left w:val="none" w:sz="0" w:space="0" w:color="000000"/>
+                <w:right w:val="none" w:sz="0" w:space="0" w:color="000000"/>
+              </w:pBdr>
+              <w:spacing w:after="100" w:before="100" w:line="240"/>
+              <w:ind w:left="100" w:right="100" w:firstLine="0" w:firstLineChars="0"/>
+              <w:rPr>
+                <w:rFonts w:ascii="DejaVu Sans" w:hAnsi="DejaVu Sans" w:eastAsia="DejaVu Sans" w:cs="DejaVu Sans"/>
+                <w:i w:val="false"/>
+                <w:b w:val="false"/>
+                <w:u w:val="none"/>
+                <w:strike w:val="false"/>
+                <w:sz w:val="22"/>
+                <w:szCs w:val="22"/>
+                <w:color w:val="000000"/>
+              </w:rPr>
+            </w:pPr>
+            <w:r>
+              <w:rPr>
+                <w:rFonts w:ascii="DejaVu Sans" w:hAnsi="DejaVu Sans" w:eastAsia="DejaVu Sans" w:cs="DejaVu Sans"/>
+                <w:i w:val="false"/>
+                <w:b w:val="false"/>
+                <w:u w:val="none"/>
+                <w:strike w:val="false"/>
+                <w:sz w:val="22"/>
+                <w:szCs w:val="22"/>
+                <w:color w:val="000000"/>
+              </w:rPr>
+              <w:t xml:space="preserve">389.9</w:t>
+            </w:r>
+          </w:p>
+        </w:tc>
+        <w:tc>
+          <w:tcPr>
+            <w:tcBorders>
+              <w:bottom w:val="none" w:sz="0" w:space="0" w:color="000000"/>
+              <w:top w:val="none" w:sz="0" w:space="0" w:color="000000"/>
+              <w:left w:val="none" w:sz="0" w:space="0" w:color="000000"/>
+              <w:right w:val="none" w:sz="0" w:space="0" w:color="000000"/>
+            </w:tcBorders>
+            <w:shd w:val="clear" w:color="auto" w:fill="FFFFFF"/>
+            <w:tcMar>
+              <w:top w:w="0" w:type="dxa"/>
+              <w:bottom w:w="0" w:type="dxa"/>
+              <w:left w:w="0" w:type="dxa"/>
+              <w:right w:w="0" w:type="dxa"/>
+            </w:tcMar>
+            <w:vAlign w:val="center"/>
+          </w:tcPr>
+          <w:p>
+            <w:pPr>
+              <w:jc w:val="right"/>
+              <w:pBdr>
+                <w:bottom w:val="none" w:sz="0" w:space="0" w:color="000000"/>
+                <w:top w:val="none" w:sz="0" w:space="0" w:color="000000"/>
+                <w:left w:val="none" w:sz="0" w:space="0" w:color="000000"/>
+                <w:right w:val="none" w:sz="0" w:space="0" w:color="000000"/>
+              </w:pBdr>
+              <w:spacing w:after="100" w:before="100" w:line="240"/>
+              <w:ind w:left="100" w:right="100" w:firstLine="0" w:firstLineChars="0"/>
+              <w:rPr>
+                <w:rFonts w:ascii="DejaVu Sans" w:hAnsi="DejaVu Sans" w:eastAsia="DejaVu Sans" w:cs="DejaVu Sans"/>
+                <w:i w:val="false"/>
+                <w:b w:val="false"/>
+                <w:u w:val="none"/>
+                <w:strike w:val="false"/>
+                <w:sz w:val="22"/>
+                <w:szCs w:val="22"/>
+                <w:color w:val="000000"/>
+              </w:rPr>
+            </w:pPr>
+            <w:r>
+              <w:rPr>
+                <w:rFonts w:ascii="DejaVu Sans" w:hAnsi="DejaVu Sans" w:eastAsia="DejaVu Sans" w:cs="DejaVu Sans"/>
+                <w:i w:val="false"/>
+                <w:b w:val="false"/>
+                <w:u w:val="none"/>
+                <w:strike w:val="false"/>
+                <w:sz w:val="22"/>
+                <w:szCs w:val="22"/>
+                <w:color w:val="000000"/>
+              </w:rPr>
+              <w:t xml:space="preserve">66.8</w:t>
+            </w:r>
+          </w:p>
+        </w:tc>
+        <w:tc>
+          <w:tcPr>
+            <w:tcBorders>
+              <w:bottom w:val="none" w:sz="0" w:space="0" w:color="000000"/>
+              <w:top w:val="none" w:sz="0" w:space="0" w:color="000000"/>
+              <w:left w:val="none" w:sz="0" w:space="0" w:color="000000"/>
+              <w:right w:val="none" w:sz="0" w:space="0" w:color="000000"/>
+            </w:tcBorders>
+            <w:shd w:val="clear" w:color="auto" w:fill="FFFFFF"/>
+            <w:tcMar>
+              <w:top w:w="0" w:type="dxa"/>
+              <w:bottom w:w="0" w:type="dxa"/>
+              <w:left w:w="0" w:type="dxa"/>
+              <w:right w:w="0" w:type="dxa"/>
+            </w:tcMar>
+            <w:vAlign w:val="center"/>
+          </w:tcPr>
+          <w:p>
+            <w:pPr>
+              <w:jc w:val="right"/>
+              <w:pBdr>
+                <w:bottom w:val="none" w:sz="0" w:space="0" w:color="000000"/>
+                <w:top w:val="none" w:sz="0" w:space="0" w:color="000000"/>
+                <w:left w:val="none" w:sz="0" w:space="0" w:color="000000"/>
+                <w:right w:val="none" w:sz="0" w:space="0" w:color="000000"/>
+              </w:pBdr>
+              <w:spacing w:after="100" w:before="100" w:line="240"/>
+              <w:ind w:left="100" w:right="100" w:firstLine="0" w:firstLineChars="0"/>
+              <w:rPr>
+                <w:rFonts w:ascii="DejaVu Sans" w:hAnsi="DejaVu Sans" w:eastAsia="DejaVu Sans" w:cs="DejaVu Sans"/>
+                <w:i w:val="false"/>
+                <w:b w:val="false"/>
+                <w:u w:val="none"/>
+                <w:strike w:val="false"/>
+                <w:sz w:val="22"/>
+                <w:szCs w:val="22"/>
+                <w:color w:val="000000"/>
+              </w:rPr>
+            </w:pPr>
+            <w:r>
+              <w:rPr>
+                <w:rFonts w:ascii="DejaVu Sans" w:hAnsi="DejaVu Sans" w:eastAsia="DejaVu Sans" w:cs="DejaVu Sans"/>
+                <w:i w:val="false"/>
+                <w:b w:val="false"/>
+                <w:u w:val="none"/>
+                <w:strike w:val="false"/>
+                <w:sz w:val="22"/>
+                <w:szCs w:val="22"/>
+                <w:color w:val="000000"/>
+              </w:rPr>
+              <w:t xml:space="preserve">0.6</w:t>
+            </w:r>
+          </w:p>
+        </w:tc>
+      </w:tr>
+      <w:tr>
+        <w:trPr>
+          <w:trHeight w:val="608" w:hRule="auto"/>
+        </w:trPr>
+        <w:tc>
+          <w:tcPr>
+            <w:tcBorders>
+              <w:bottom w:val="none" w:sz="0" w:space="0" w:color="000000"/>
+              <w:top w:val="none" w:sz="0" w:space="0" w:color="000000"/>
+              <w:left w:val="none" w:sz="0" w:space="0" w:color="000000"/>
+              <w:right w:val="none" w:sz="0" w:space="0" w:color="000000"/>
+            </w:tcBorders>
+            <w:shd w:val="clear" w:color="auto" w:fill="FFFFFF"/>
+            <w:tcMar>
+              <w:top w:w="0" w:type="dxa"/>
+              <w:bottom w:w="0" w:type="dxa"/>
+              <w:left w:w="0" w:type="dxa"/>
+              <w:right w:w="0" w:type="dxa"/>
+            </w:tcMar>
+            <w:vAlign w:val="center"/>
+          </w:tcPr>
+          <w:p>
+            <w:pPr>
+              <w:jc w:val="left"/>
+              <w:pBdr>
+                <w:bottom w:val="none" w:sz="0" w:space="0" w:color="000000"/>
+                <w:top w:val="none" w:sz="0" w:space="0" w:color="000000"/>
+                <w:left w:val="none" w:sz="0" w:space="0" w:color="000000"/>
+                <w:right w:val="none" w:sz="0" w:space="0" w:color="000000"/>
+              </w:pBdr>
+              <w:spacing w:after="100" w:before="100" w:line="240"/>
+              <w:ind w:left="100" w:right="100" w:firstLine="0" w:firstLineChars="0"/>
+              <w:rPr>
+                <w:rFonts w:ascii="DejaVu Sans" w:hAnsi="DejaVu Sans" w:eastAsia="DejaVu Sans" w:cs="DejaVu Sans"/>
+                <w:i w:val="false"/>
+                <w:b w:val="false"/>
+                <w:u w:val="none"/>
+                <w:strike w:val="false"/>
+                <w:sz w:val="22"/>
+                <w:szCs w:val="22"/>
+                <w:color w:val="000000"/>
+              </w:rPr>
+            </w:pPr>
+            <w:r>
+              <w:rPr>
+                <w:rFonts w:ascii="DejaVu Sans" w:hAnsi="DejaVu Sans" w:eastAsia="DejaVu Sans" w:cs="DejaVu Sans"/>
+                <w:i w:val="false"/>
+                <w:b w:val="false"/>
+                <w:u w:val="none"/>
+                <w:strike w:val="false"/>
+                <w:sz w:val="22"/>
+                <w:szCs w:val="22"/>
+                <w:color w:val="000000"/>
+              </w:rPr>
+              <w:t xml:space="preserve">12</w:t>
+            </w:r>
+          </w:p>
+        </w:tc>
+        <w:tc>
+          <w:tcPr>
+            <w:tcBorders>
+              <w:bottom w:val="none" w:sz="0" w:space="0" w:color="000000"/>
+              <w:top w:val="none" w:sz="0" w:space="0" w:color="000000"/>
+              <w:left w:val="none" w:sz="0" w:space="0" w:color="000000"/>
+              <w:right w:val="none" w:sz="0" w:space="0" w:color="000000"/>
+            </w:tcBorders>
+            <w:shd w:val="clear" w:color="auto" w:fill="FFFFFF"/>
+            <w:tcMar>
+              <w:top w:w="0" w:type="dxa"/>
+              <w:bottom w:w="0" w:type="dxa"/>
+              <w:left w:w="0" w:type="dxa"/>
+              <w:right w:w="0" w:type="dxa"/>
+            </w:tcMar>
+            <w:vAlign w:val="center"/>
+          </w:tcPr>
+          <w:p>
+            <w:pPr>
+              <w:jc w:val="right"/>
+              <w:pBdr>
+                <w:bottom w:val="none" w:sz="0" w:space="0" w:color="000000"/>
+                <w:top w:val="none" w:sz="0" w:space="0" w:color="000000"/>
+                <w:left w:val="none" w:sz="0" w:space="0" w:color="000000"/>
+                <w:right w:val="none" w:sz="0" w:space="0" w:color="000000"/>
+              </w:pBdr>
+              <w:spacing w:after="100" w:before="100" w:line="240"/>
+              <w:ind w:left="100" w:right="100" w:firstLine="0" w:firstLineChars="0"/>
+              <w:rPr>
+                <w:rFonts w:ascii="DejaVu Sans" w:hAnsi="DejaVu Sans" w:eastAsia="DejaVu Sans" w:cs="DejaVu Sans"/>
+                <w:i w:val="false"/>
+                <w:b w:val="false"/>
+                <w:u w:val="none"/>
+                <w:strike w:val="false"/>
+                <w:sz w:val="22"/>
+                <w:szCs w:val="22"/>
+                <w:color w:val="000000"/>
+              </w:rPr>
+            </w:pPr>
+            <w:r>
+              <w:rPr>
+                <w:rFonts w:ascii="DejaVu Sans" w:hAnsi="DejaVu Sans" w:eastAsia="DejaVu Sans" w:cs="DejaVu Sans"/>
+                <w:i w:val="false"/>
+                <w:b w:val="false"/>
+                <w:u w:val="none"/>
+                <w:strike w:val="false"/>
+                <w:sz w:val="22"/>
+                <w:szCs w:val="22"/>
+                <w:color w:val="000000"/>
+              </w:rPr>
+              <w:t xml:space="preserve">367.5</w:t>
+            </w:r>
+          </w:p>
+        </w:tc>
+        <w:tc>
+          <w:tcPr>
+            <w:tcBorders>
+              <w:bottom w:val="none" w:sz="0" w:space="0" w:color="000000"/>
+              <w:top w:val="none" w:sz="0" w:space="0" w:color="000000"/>
+              <w:left w:val="none" w:sz="0" w:space="0" w:color="000000"/>
+              <w:right w:val="none" w:sz="0" w:space="0" w:color="000000"/>
+            </w:tcBorders>
+            <w:shd w:val="clear" w:color="auto" w:fill="FFFFFF"/>
+            <w:tcMar>
+              <w:top w:w="0" w:type="dxa"/>
+              <w:bottom w:w="0" w:type="dxa"/>
+              <w:left w:w="0" w:type="dxa"/>
+              <w:right w:w="0" w:type="dxa"/>
+            </w:tcMar>
+            <w:vAlign w:val="center"/>
+          </w:tcPr>
+          <w:p>
+            <w:pPr>
+              <w:jc w:val="right"/>
+              <w:pBdr>
+                <w:bottom w:val="none" w:sz="0" w:space="0" w:color="000000"/>
+                <w:top w:val="none" w:sz="0" w:space="0" w:color="000000"/>
+                <w:left w:val="none" w:sz="0" w:space="0" w:color="000000"/>
+                <w:right w:val="none" w:sz="0" w:space="0" w:color="000000"/>
+              </w:pBdr>
+              <w:spacing w:after="100" w:before="100" w:line="240"/>
+              <w:ind w:left="100" w:right="100" w:firstLine="0" w:firstLineChars="0"/>
+              <w:rPr>
+                <w:rFonts w:ascii="DejaVu Sans" w:hAnsi="DejaVu Sans" w:eastAsia="DejaVu Sans" w:cs="DejaVu Sans"/>
+                <w:i w:val="false"/>
+                <w:b w:val="false"/>
+                <w:u w:val="none"/>
+                <w:strike w:val="false"/>
+                <w:sz w:val="22"/>
+                <w:szCs w:val="22"/>
+                <w:color w:val="000000"/>
+              </w:rPr>
+            </w:pPr>
+            <w:r>
+              <w:rPr>
+                <w:rFonts w:ascii="DejaVu Sans" w:hAnsi="DejaVu Sans" w:eastAsia="DejaVu Sans" w:cs="DejaVu Sans"/>
+                <w:i w:val="false"/>
+                <w:b w:val="false"/>
+                <w:u w:val="none"/>
+                <w:strike w:val="false"/>
+                <w:sz w:val="22"/>
+                <w:szCs w:val="22"/>
+                <w:color w:val="000000"/>
+              </w:rPr>
+              <w:t xml:space="preserve">42.6</w:t>
+            </w:r>
+          </w:p>
+        </w:tc>
+        <w:tc>
+          <w:tcPr>
+            <w:tcBorders>
+              <w:bottom w:val="none" w:sz="0" w:space="0" w:color="000000"/>
+              <w:top w:val="none" w:sz="0" w:space="0" w:color="000000"/>
+              <w:left w:val="none" w:sz="0" w:space="0" w:color="000000"/>
+              <w:right w:val="none" w:sz="0" w:space="0" w:color="000000"/>
+            </w:tcBorders>
+            <w:shd w:val="clear" w:color="auto" w:fill="FFFFFF"/>
+            <w:tcMar>
+              <w:top w:w="0" w:type="dxa"/>
+              <w:bottom w:w="0" w:type="dxa"/>
+              <w:left w:w="0" w:type="dxa"/>
+              <w:right w:w="0" w:type="dxa"/>
+            </w:tcMar>
+            <w:vAlign w:val="center"/>
+          </w:tcPr>
+          <w:p>
+            <w:pPr>
+              <w:jc w:val="right"/>
+              <w:pBdr>
+                <w:bottom w:val="none" w:sz="0" w:space="0" w:color="000000"/>
+                <w:top w:val="none" w:sz="0" w:space="0" w:color="000000"/>
+                <w:left w:val="none" w:sz="0" w:space="0" w:color="000000"/>
+                <w:right w:val="none" w:sz="0" w:space="0" w:color="000000"/>
+              </w:pBdr>
+              <w:spacing w:after="100" w:before="100" w:line="240"/>
+              <w:ind w:left="100" w:right="100" w:firstLine="0" w:firstLineChars="0"/>
+              <w:rPr>
+                <w:rFonts w:ascii="DejaVu Sans" w:hAnsi="DejaVu Sans" w:eastAsia="DejaVu Sans" w:cs="DejaVu Sans"/>
+                <w:i w:val="false"/>
+                <w:b w:val="false"/>
+                <w:u w:val="none"/>
+                <w:strike w:val="false"/>
+                <w:sz w:val="22"/>
+                <w:szCs w:val="22"/>
+                <w:color w:val="000000"/>
+              </w:rPr>
+            </w:pPr>
+            <w:r>
+              <w:rPr>
+                <w:rFonts w:ascii="DejaVu Sans" w:hAnsi="DejaVu Sans" w:eastAsia="DejaVu Sans" w:cs="DejaVu Sans"/>
+                <w:i w:val="false"/>
+                <w:b w:val="false"/>
+                <w:u w:val="none"/>
+                <w:strike w:val="false"/>
+                <w:sz w:val="22"/>
+                <w:szCs w:val="22"/>
+                <w:color w:val="000000"/>
+              </w:rPr>
+              <w:t xml:space="preserve">1.3</w:t>
             </w:r>
           </w:p>
         </w:tc>
@@ -11683,7 +13599,7 @@
                 <w:szCs w:val="22"/>
                 <w:color w:val="000000"/>
               </w:rPr>
-              <w:t xml:space="preserve">Save_3</w:t>
+              <w:t xml:space="preserve">13</w:t>
             </w:r>
           </w:p>
         </w:tc>
@@ -11737,7 +13653,7 @@
                 <w:szCs w:val="22"/>
                 <w:color w:val="000000"/>
               </w:rPr>
-              <w:t xml:space="preserve">307.1</w:t>
+              <w:t xml:space="preserve">338.3</w:t>
             </w:r>
           </w:p>
         </w:tc>
@@ -11791,7 +13707,7 @@
                 <w:szCs w:val="22"/>
                 <w:color w:val="000000"/>
               </w:rPr>
-              <w:t xml:space="preserve">116.7</w:t>
+              <w:t xml:space="preserve">15.2</w:t>
             </w:r>
           </w:p>
         </w:tc>
@@ -11845,7 +13761,7 @@
                 <w:szCs w:val="22"/>
                 <w:color w:val="000000"/>
               </w:rPr>
-              <w:t xml:space="preserve">1.7</w:t>
+              <w:t xml:space="preserve">2.5</w:t>
             </w:r>
           </w:p>
         </w:tc>
@@ -12018,7 +13934,7 @@
         <w:rPr>
           <w:rStyle w:val="VerbatimChar"/>
         </w:rPr>
-        <w:t xml:space="preserve">[1] '2026.6.0.242'</w:t>
+        <w:t xml:space="preserve">[1] '2026.8.2.200'</w:t>
       </w:r>
       <w:r>
         <w:br/>
@@ -12039,7 +13955,7 @@
         <w:rPr>
           <w:rStyle w:val="VerbatimChar"/>
         </w:rPr>
-        <w:t xml:space="preserve">[1] "2026.06.0+242"</w:t>
+        <w:t xml:space="preserve">[1] "2026.08.2+200"</w:t>
       </w:r>
       <w:r>
         <w:br/>
@@ -12060,7 +13976,7 @@
         <w:rPr>
           <w:rStyle w:val="VerbatimChar"/>
         </w:rPr>
-        <w:t xml:space="preserve">[1] "Blue Plumbago"</w:t>
+        <w:t xml:space="preserve">[1] "Yellow Yarrow"</w:t>
       </w:r>
     </w:p>
     <w:p>
@@ -12089,7 +14005,7 @@
         <w:rPr>
           <w:rStyle w:val="VerbatimChar"/>
         </w:rPr>
-        <w:t xml:space="preserve">Running under: Ubuntu 26.04 LTS</w:t>
+        <w:t xml:space="preserve">Running under: Ubuntu 26.04.1 LTS</w:t>
       </w:r>
       <w:r>
         <w:br/>
@@ -12257,7 +14173,7 @@
         <w:rPr>
           <w:rStyle w:val="VerbatimChar"/>
         </w:rPr>
-        <w:t xml:space="preserve"> [1] ncdf4_1.24          readxl_1.5.0        sf_1.1-1           </w:t>
+        <w:t xml:space="preserve"> [1] dtplyr_1.3.3        ncdf4_1.24          readxl_1.5.0       </w:t>
       </w:r>
       <w:r>
         <w:br/>
@@ -12266,7 +14182,7 @@
         <w:rPr>
           <w:rStyle w:val="VerbatimChar"/>
         </w:rPr>
-        <w:t xml:space="preserve"> [4] dtplyr_1.3.3        data.table_1.18.4   RhpcBLASctl_0.23-42</w:t>
+        <w:t xml:space="preserve"> [4] data.table_1.18.6.1 sf_1.1-2            RhpcBLASctl_0.23-42</w:t>
       </w:r>
       <w:r>
         <w:br/>
@@ -12284,7 +14200,7 @@
         <w:rPr>
           <w:rStyle w:val="VerbatimChar"/>
         </w:rPr>
-        <w:t xml:space="preserve">[10] flextable_0.9.12    lubridate_1.9.5     forcats_1.0.1      </w:t>
+        <w:t xml:space="preserve">[10] flextable_0.10.0    lubridate_1.9.5     forcats_1.0.1      </w:t>
       </w:r>
       <w:r>
         <w:br/>
@@ -12332,7 +14248,7 @@
         <w:rPr>
           <w:rStyle w:val="VerbatimChar"/>
         </w:rPr>
-        <w:t xml:space="preserve"> [1] gtable_0.3.6            xfun_0.59               bspm_0.5.8             </w:t>
+        <w:t xml:space="preserve"> [1] gtable_0.3.6            xfun_0.60               bspm_0.5.8             </w:t>
       </w:r>
       <w:r>
         <w:br/>
@@ -12359,7 +14275,7 @@
         <w:rPr>
           <w:rStyle w:val="VerbatimChar"/>
         </w:rPr>
-        <w:t xml:space="preserve">[10] KernSmooth_2.23-26      RColorBrewer_1.1-3      S7_0.2.2               </w:t>
+        <w:t xml:space="preserve">[10] KernSmooth_2.23-27      RColorBrewer_1.1-3      S7_0.2.2               </w:t>
       </w:r>
       <w:r>
         <w:br/>
@@ -12395,7 +14311,7 @@
         <w:rPr>
           <w:rStyle w:val="VerbatimChar"/>
         </w:rPr>
-        <w:t xml:space="preserve">[22] fontLiberation_0.1.0    class_7.3-23            htmltools_0.5.9        </w:t>
+        <w:t xml:space="preserve">[22] fontLiberation_0.1.0    class_7.3-24            htmltools_0.5.9        </w:t>
       </w:r>
       <w:r>
         <w:br/>
@@ -12422,7 +14338,7 @@
         <w:rPr>
           <w:rStyle w:val="VerbatimChar"/>
         </w:rPr>
-        <w:t xml:space="preserve">[31] tidyselect_1.2.1        zip_3.0.0               digest_0.6.39          </w:t>
+        <w:t xml:space="preserve">[31] tidyselect_1.2.1        zip_3.0.2               digest_0.6.39          </w:t>
       </w:r>
       <w:r>
         <w:br/>
@@ -12431,7 +14347,7 @@
         <w:rPr>
           <w:rStyle w:val="VerbatimChar"/>
         </w:rPr>
-        <w:t xml:space="preserve">[34] stringi_1.8.7           fastmap_1.2.0           grid_4.6.1             </w:t>
+        <w:t xml:space="preserve">[34] stringi_1.8.9           fastmap_1.2.0           grid_4.6.1             </w:t>
       </w:r>
       <w:r>
         <w:br/>
@@ -12440,7 +14356,7 @@
         <w:rPr>
           <w:rStyle w:val="VerbatimChar"/>
         </w:rPr>
-        <w:t xml:space="preserve">[37] cli_3.6.6               magrittr_2.0.5          e1071_1.7-17           </w:t>
+        <w:t xml:space="preserve">[37] cli_3.6.6               magrittr_2.0.5          patchwork_1.3.2        </w:t>
       </w:r>
       <w:r>
         <w:br/>
@@ -12449,7 +14365,7 @@
         <w:rPr>
           <w:rStyle w:val="VerbatimChar"/>
         </w:rPr>
-        <w:t xml:space="preserve">[40] withr_3.0.3             gdtools_0.5.1           scales_1.4.0           </w:t>
+        <w:t xml:space="preserve">[40] e1071_1.7-17            withr_3.0.3             gdtools_0.5.1          </w:t>
       </w:r>
       <w:r>
         <w:br/>
@@ -12458,7 +14374,7 @@
         <w:rPr>
           <w:rStyle w:val="VerbatimChar"/>
         </w:rPr>
-        <w:t xml:space="preserve">[43] timechange_0.4.0        rmarkdown_2.31          officer_0.7.5          </w:t>
+        <w:t xml:space="preserve">[43] scales_1.4.0            timechange_0.4.0        rmarkdown_2.32         </w:t>
       </w:r>
       <w:r>
         <w:br/>
@@ -12467,7 +14383,7 @@
         <w:rPr>
           <w:rStyle w:val="VerbatimChar"/>
         </w:rPr>
-        <w:t xml:space="preserve">[46] otel_0.2.0              cellranger_1.1.0        askpass_1.2.1          </w:t>
+        <w:t xml:space="preserve">[46] officer_0.7.6           otel_0.2.0              cellranger_1.1.0       </w:t>
       </w:r>
       <w:r>
         <w:br/>
@@ -12476,7 +14392,7 @@
         <w:rPr>
           <w:rStyle w:val="VerbatimChar"/>
         </w:rPr>
-        <w:t xml:space="preserve">[49] ragg_1.5.2              hms_1.1.4               memoise_2.0.1          </w:t>
+        <w:t xml:space="preserve">[49] askpass_1.2.1           ragg_1.5.2              hms_1.1.4              </w:t>
       </w:r>
       <w:r>
         <w:br/>
@@ -12485,7 +14401,7 @@
         <w:rPr>
           <w:rStyle w:val="VerbatimChar"/>
         </w:rPr>
-        <w:t xml:space="preserve">[52] evaluate_1.0.5          knitr_1.51              rlang_1.3.0            </w:t>
+        <w:t xml:space="preserve">[52] memoise_2.0.1           evaluate_1.0.5          knitr_1.51             </w:t>
       </w:r>
       <w:r>
         <w:br/>
@@ -12494,7 +14410,7 @@
         <w:rPr>
           <w:rStyle w:val="VerbatimChar"/>
         </w:rPr>
-        <w:t xml:space="preserve">[55] Rcpp_1.1.2              DBI_1.3.0               glue_1.8.1             </w:t>
+        <w:t xml:space="preserve">[55] rlang_1.3.0             Rcpp_1.1.2              DBI_1.3.0              </w:t>
       </w:r>
       <w:r>
         <w:br/>
@@ -12503,7 +14419,7 @@
         <w:rPr>
           <w:rStyle w:val="VerbatimChar"/>
         </w:rPr>
-        <w:t xml:space="preserve">[58] xml2_1.6.0              rstudioapi_0.19.0       R6_2.6.1               </w:t>
+        <w:t xml:space="preserve">[58] glue_1.8.1              xml2_1.6.0              rstudioapi_0.19.0      </w:t>
       </w:r>
       <w:r>
         <w:br/>
@@ -12512,10 +14428,10 @@
         <w:rPr>
           <w:rStyle w:val="VerbatimChar"/>
         </w:rPr>
-        <w:t xml:space="preserve">[61] units_1.0-1             systemfonts_1.3.2      </w:t>
+        <w:t xml:space="preserve">[61] R6_2.6.1                units_1.0-1             systemfonts_1.3.2      </w:t>
       </w:r>
     </w:p>
-    <w:bookmarkEnd w:id="27"/>
+    <w:bookmarkEnd w:id="26"/>
     <w:sectPr>
       <w:headerReference r:id="rId4" w:type="even"/>
       <w:headerReference r:id="rId5" w:type="default"/>

</xml_diff>